<commit_message>
build(exemplars): regenerate tracked outputs post-split; align gates with subpackaged layout
</commit_message>
<xml_diff>
--- a/projects/templates/template_code_project/output/docx/template_code_project_combined.docx
+++ b/projects/templates/template_code_project/output/docx/template_code_project_combined.docx
@@ -639,7 +639,7 @@
         <w:rPr>
           <w:rStyle w:val="VerbatimChar"/>
         </w:rPr>
-        <w:t xml:space="preserve">projects/templates/template_code_project/src/optimizer.py</w:t>
+        <w:t xml:space="preserve">projects/templates/template_code_project/src/template_code_project/core/optimizer.py</w:t>
       </w:r>
       <w:r>
         <w:t xml:space="preserve">; experiments and figures are orchestrated by</w:t>
@@ -774,7 +774,7 @@
         <w:rPr>
           <w:rStyle w:val="VerbatimChar"/>
         </w:rPr>
-        <w:t xml:space="preserve">src/figures/</w:t>
+        <w:t xml:space="preserve">src/template_code_project/figures/</w:t>
       </w:r>
       <w:r>
         <w:t xml:space="preserve"> </w:t>
@@ -789,7 +789,7 @@
         <w:rPr>
           <w:rStyle w:val="VerbatimChar"/>
         </w:rPr>
-        <w:t xml:space="preserve">src/analysis/</w:t>
+        <w:t xml:space="preserve">src/template_code_project/analysis/</w:t>
       </w:r>
       <w:r>
         <w:t xml:space="preserve">.</w:t>
@@ -2043,7 +2043,7 @@
         <w:rPr>
           <w:rStyle w:val="VerbatimChar"/>
         </w:rPr>
-        <w:t xml:space="preserve">src/figures/</w:t>
+        <w:t xml:space="preserve">src/template_code_project/figures/</w:t>
       </w:r>
       <w:r>
         <w:t xml:space="preserve"> </w:t>
@@ -3563,7 +3563,7 @@
         <w:rPr>
           <w:rStyle w:val="VerbatimChar"/>
         </w:rPr>
-        <w:t xml:space="preserve">src/analysis/</w:t>
+        <w:t xml:space="preserve">src/template_code_project/analysis/</w:t>
       </w:r>
       <w:r>
         <w:t xml:space="preserve"> </w:t>
@@ -4063,7 +4063,22 @@
         <w:t xml:space="preserve"> </w:t>
       </w:r>
       <w:r>
-        <w:t xml:space="preserve">during the infrastructure build phase.</w:t>
+        <w:t xml:space="preserve">during the infrastructure build phase (negative control: the repository lexical no-mock gate</w:t>
+      </w:r>
+      <w:r>
+        <w:t xml:space="preserve"> </w:t>
+      </w:r>
+      <w:r>
+        <w:rPr>
+          <w:rStyle w:val="VerbatimChar"/>
+        </w:rPr>
+        <w:t xml:space="preserve">scripts/audit/verify_no_mocks.py --inventory</w:t>
+      </w:r>
+      <w:r>
+        <w:t xml:space="preserve"> </w:t>
+      </w:r>
+      <w:r>
+        <w:t xml:space="preserve">flags any prohibited mock import or call and fails on dependency-replacement debt).</w:t>
       </w:r>
     </w:p>
     <w:p>
@@ -4108,7 +4123,7 @@
         <w:rPr>
           <w:rStyle w:val="VerbatimChar"/>
         </w:rPr>
-        <w:t xml:space="preserve">src/optimizer.py</w:t>
+        <w:t xml:space="preserve">src/template_code_project/core/optimizer.py</w:t>
       </w:r>
       <w:r>
         <w:t xml:space="preserve"> </w:t>
@@ -4228,7 +4243,37 @@
         <w:t xml:space="preserve"> </w:t>
       </w:r>
       <w:r>
-        <w:t xml:space="preserve">prior to treating the project as build-green.</w:t>
+        <w:t xml:space="preserve">prior to treating the project as build-green. Coverage below the floor fails the test process through</w:t>
+      </w:r>
+      <w:r>
+        <w:t xml:space="preserve"> </w:t>
+      </w:r>
+      <w:r>
+        <w:rPr>
+          <w:rStyle w:val="VerbatimChar"/>
+        </w:rPr>
+        <w:t xml:space="preserve">--cov-fail-under</w:t>
+      </w:r>
+      <w:r>
+        <w:t xml:space="preserve">, so build-green status cannot be reached while silently skipping weakened coverage.</w:t>
+      </w:r>
+      <w:r>
+        <w:t xml:space="preserve"> </w:t>
+      </w:r>
+      <w:r>
+        <w:t xml:space="preserve">Falling below that floor fails the gate outright (</w:t>
+      </w:r>
+      <w:r>
+        <w:rPr>
+          <w:rStyle w:val="VerbatimChar"/>
+        </w:rPr>
+        <w:t xml:space="preserve">--cov-fail-under</w:t>
+      </w:r>
+      <w:r>
+        <w:t xml:space="preserve"> </w:t>
+      </w:r>
+      <w:r>
+        <w:t xml:space="preserve">enforces it).</w:t>
       </w:r>
     </w:p>
     <w:bookmarkEnd w:id="41"/>
@@ -4463,7 +4508,7 @@
         <w:rPr>
           <w:rStyle w:val="VerbatimChar"/>
         </w:rPr>
-        <w:t xml:space="preserve">src/figures/</w:t>
+        <w:t xml:space="preserve">src/template_code_project/figures/</w:t>
       </w:r>
       <w:r>
         <w:t xml:space="preserve"> </w:t>
@@ -4547,7 +4592,7 @@
         <w:rPr>
           <w:rStyle w:val="VerbatimChar"/>
         </w:rPr>
-        <w:t xml:space="preserve">src/analysis/</w:t>
+        <w:t xml:space="preserve">src/template_code_project/analysis/</w:t>
       </w:r>
       <w:r>
         <w:t xml:space="preserve"> </w:t>
@@ -4939,7 +4984,7 @@
           <wp:inline>
             <wp:extent cx="5334000" cy="3707780"/>
             <wp:effectExtent b="0" l="0" r="0" t="0"/>
-            <wp:docPr descr="Figure 1: Objective value f(x_k)=\tfrac{1}{2}x_k^2 - x_k versus iteration k for gradient descent at six step sizes (legend colours follow the agency taxonomy in sec. 3: blue = conservative, green = near-optimal, orange = aggressive, red = divergent). Trajectories are produced by simulate_trajectory() in src/optimizer.py, which calls the same gradient_descent() used in tbl. 1; the upper bound on the y-axis clips the divergent \alpha=2.5 curve so that stable trajectories remain visible. Dashed grey reference line marks the analytic optimum f(x^\ast)=-0.5. Fastest configuration in this experiment: \alpha=1.0 converges in 1 iteration(s)." title="" id="49" name="Picture"/>
+            <wp:docPr descr="Figure 1: Objective value f(x_k)=\tfrac{1}{2}x_k^2 - x_k versus iteration k for gradient descent at six step sizes (legend colours follow the agency taxonomy in sec. 3: blue = conservative, green = near-optimal, orange = aggressive, red = divergent). Trajectories are produced by simulate_trajectory() in src/template_code_project/core/optimizer.py, which calls the same gradient_descent() used in tbl. 1; the upper bound on the y-axis clips the divergent \alpha=2.5 curve so that stable trajectories remain visible. Dashed grey reference line marks the analytic optimum f(x^\ast)=-0.5. Fastest configuration in this experiment: \alpha=1.0 converges in 1 iteration(s)." title="" id="49" name="Picture"/>
             <a:graphic>
               <a:graphicData uri="http://schemas.openxmlformats.org/drawingml/2006/picture">
                 <pic:pic>
@@ -5114,7 +5159,7 @@
         <w:rPr>
           <w:rStyle w:val="VerbatimChar"/>
         </w:rPr>
-        <w:t xml:space="preserve">src/optimizer.py</w:t>
+        <w:t xml:space="preserve">src/template_code_project/core/optimizer.py</w:t>
       </w:r>
       <w:r>
         <w:t xml:space="preserve">, which calls the same</w:t>
@@ -13066,7 +13111,7 @@
         <w:t xml:space="preserve">Python</w:t>
       </w:r>
       <w:r>
-        <w:t xml:space="preserve">: 3.12.12</w:t>
+        <w:t xml:space="preserve">: 3.12.13</w:t>
       </w:r>
     </w:p>
     <w:p>
@@ -13123,7 +13168,7 @@
         <w:t xml:space="preserve">Generated</w:t>
       </w:r>
       <w:r>
-        <w:t xml:space="preserve">: 2026-08-14T14:20:53Z</w:t>
+        <w:t xml:space="preserve">: 2026-09-13T21:49:02Z</w:t>
       </w:r>
     </w:p>
     <w:bookmarkEnd w:id="109"/>
@@ -14360,7 +14405,7 @@
         <w:rPr>
           <w:rStyle w:val="VerbatimChar"/>
         </w:rPr>
-        <w:t xml:space="preserve">src/benchmark_support.py</w:t>
+        <w:t xml:space="preserve">src/template_code_project/core/benchmark_support.py</w:t>
       </w:r>
       <w:r>
         <w:t xml:space="preserve">, which evaluates the pure</w:t>
@@ -15036,7 +15081,7 @@
         <w:rPr>
           <w:rStyle w:val="VerbatimChar"/>
         </w:rPr>
-        <w:t xml:space="preserve">src/optimizer.py</w:t>
+        <w:t xml:space="preserve">src/template_code_project/core/optimizer.py</w:t>
       </w:r>
       <w:r>
         <w:t xml:space="preserve">; there is no Wolfe or Armijo backtracking.</w:t>

</xml_diff>

<commit_message>
build(exemplars): regenerate tracked outputs post-split; align gates with subpackaged layout (#101)
* build(exemplars): regenerate tracked outputs post-split; align gates with subpackaged layout

* docs: refresh coverage provenance after exemplar receipt regeneration
</commit_message>
<xml_diff>
--- a/projects/templates/template_code_project/output/docx/template_code_project_combined.docx
+++ b/projects/templates/template_code_project/output/docx/template_code_project_combined.docx
@@ -639,7 +639,7 @@
         <w:rPr>
           <w:rStyle w:val="VerbatimChar"/>
         </w:rPr>
-        <w:t xml:space="preserve">projects/templates/template_code_project/src/optimizer.py</w:t>
+        <w:t xml:space="preserve">projects/templates/template_code_project/src/template_code_project/core/optimizer.py</w:t>
       </w:r>
       <w:r>
         <w:t xml:space="preserve">; experiments and figures are orchestrated by</w:t>
@@ -774,7 +774,7 @@
         <w:rPr>
           <w:rStyle w:val="VerbatimChar"/>
         </w:rPr>
-        <w:t xml:space="preserve">src/figures/</w:t>
+        <w:t xml:space="preserve">src/template_code_project/figures/</w:t>
       </w:r>
       <w:r>
         <w:t xml:space="preserve"> </w:t>
@@ -789,7 +789,7 @@
         <w:rPr>
           <w:rStyle w:val="VerbatimChar"/>
         </w:rPr>
-        <w:t xml:space="preserve">src/analysis/</w:t>
+        <w:t xml:space="preserve">src/template_code_project/analysis/</w:t>
       </w:r>
       <w:r>
         <w:t xml:space="preserve">.</w:t>
@@ -2043,7 +2043,7 @@
         <w:rPr>
           <w:rStyle w:val="VerbatimChar"/>
         </w:rPr>
-        <w:t xml:space="preserve">src/figures/</w:t>
+        <w:t xml:space="preserve">src/template_code_project/figures/</w:t>
       </w:r>
       <w:r>
         <w:t xml:space="preserve"> </w:t>
@@ -3563,7 +3563,7 @@
         <w:rPr>
           <w:rStyle w:val="VerbatimChar"/>
         </w:rPr>
-        <w:t xml:space="preserve">src/analysis/</w:t>
+        <w:t xml:space="preserve">src/template_code_project/analysis/</w:t>
       </w:r>
       <w:r>
         <w:t xml:space="preserve"> </w:t>
@@ -4063,7 +4063,22 @@
         <w:t xml:space="preserve"> </w:t>
       </w:r>
       <w:r>
-        <w:t xml:space="preserve">during the infrastructure build phase.</w:t>
+        <w:t xml:space="preserve">during the infrastructure build phase (negative control: the repository lexical no-mock gate</w:t>
+      </w:r>
+      <w:r>
+        <w:t xml:space="preserve"> </w:t>
+      </w:r>
+      <w:r>
+        <w:rPr>
+          <w:rStyle w:val="VerbatimChar"/>
+        </w:rPr>
+        <w:t xml:space="preserve">scripts/audit/verify_no_mocks.py --inventory</w:t>
+      </w:r>
+      <w:r>
+        <w:t xml:space="preserve"> </w:t>
+      </w:r>
+      <w:r>
+        <w:t xml:space="preserve">flags any prohibited mock import or call and fails on dependency-replacement debt).</w:t>
       </w:r>
     </w:p>
     <w:p>
@@ -4108,7 +4123,7 @@
         <w:rPr>
           <w:rStyle w:val="VerbatimChar"/>
         </w:rPr>
-        <w:t xml:space="preserve">src/optimizer.py</w:t>
+        <w:t xml:space="preserve">src/template_code_project/core/optimizer.py</w:t>
       </w:r>
       <w:r>
         <w:t xml:space="preserve"> </w:t>
@@ -4228,7 +4243,37 @@
         <w:t xml:space="preserve"> </w:t>
       </w:r>
       <w:r>
-        <w:t xml:space="preserve">prior to treating the project as build-green.</w:t>
+        <w:t xml:space="preserve">prior to treating the project as build-green. Coverage below the floor fails the test process through</w:t>
+      </w:r>
+      <w:r>
+        <w:t xml:space="preserve"> </w:t>
+      </w:r>
+      <w:r>
+        <w:rPr>
+          <w:rStyle w:val="VerbatimChar"/>
+        </w:rPr>
+        <w:t xml:space="preserve">--cov-fail-under</w:t>
+      </w:r>
+      <w:r>
+        <w:t xml:space="preserve">, so build-green status cannot be reached while silently skipping weakened coverage.</w:t>
+      </w:r>
+      <w:r>
+        <w:t xml:space="preserve"> </w:t>
+      </w:r>
+      <w:r>
+        <w:t xml:space="preserve">Falling below that floor fails the gate outright (</w:t>
+      </w:r>
+      <w:r>
+        <w:rPr>
+          <w:rStyle w:val="VerbatimChar"/>
+        </w:rPr>
+        <w:t xml:space="preserve">--cov-fail-under</w:t>
+      </w:r>
+      <w:r>
+        <w:t xml:space="preserve"> </w:t>
+      </w:r>
+      <w:r>
+        <w:t xml:space="preserve">enforces it).</w:t>
       </w:r>
     </w:p>
     <w:bookmarkEnd w:id="41"/>
@@ -4463,7 +4508,7 @@
         <w:rPr>
           <w:rStyle w:val="VerbatimChar"/>
         </w:rPr>
-        <w:t xml:space="preserve">src/figures/</w:t>
+        <w:t xml:space="preserve">src/template_code_project/figures/</w:t>
       </w:r>
       <w:r>
         <w:t xml:space="preserve"> </w:t>
@@ -4547,7 +4592,7 @@
         <w:rPr>
           <w:rStyle w:val="VerbatimChar"/>
         </w:rPr>
-        <w:t xml:space="preserve">src/analysis/</w:t>
+        <w:t xml:space="preserve">src/template_code_project/analysis/</w:t>
       </w:r>
       <w:r>
         <w:t xml:space="preserve"> </w:t>
@@ -4939,7 +4984,7 @@
           <wp:inline>
             <wp:extent cx="5334000" cy="3707780"/>
             <wp:effectExtent b="0" l="0" r="0" t="0"/>
-            <wp:docPr descr="Figure 1: Objective value f(x_k)=\tfrac{1}{2}x_k^2 - x_k versus iteration k for gradient descent at six step sizes (legend colours follow the agency taxonomy in sec. 3: blue = conservative, green = near-optimal, orange = aggressive, red = divergent). Trajectories are produced by simulate_trajectory() in src/optimizer.py, which calls the same gradient_descent() used in tbl. 1; the upper bound on the y-axis clips the divergent \alpha=2.5 curve so that stable trajectories remain visible. Dashed grey reference line marks the analytic optimum f(x^\ast)=-0.5. Fastest configuration in this experiment: \alpha=1.0 converges in 1 iteration(s)." title="" id="49" name="Picture"/>
+            <wp:docPr descr="Figure 1: Objective value f(x_k)=\tfrac{1}{2}x_k^2 - x_k versus iteration k for gradient descent at six step sizes (legend colours follow the agency taxonomy in sec. 3: blue = conservative, green = near-optimal, orange = aggressive, red = divergent). Trajectories are produced by simulate_trajectory() in src/template_code_project/core/optimizer.py, which calls the same gradient_descent() used in tbl. 1; the upper bound on the y-axis clips the divergent \alpha=2.5 curve so that stable trajectories remain visible. Dashed grey reference line marks the analytic optimum f(x^\ast)=-0.5. Fastest configuration in this experiment: \alpha=1.0 converges in 1 iteration(s)." title="" id="49" name="Picture"/>
             <a:graphic>
               <a:graphicData uri="http://schemas.openxmlformats.org/drawingml/2006/picture">
                 <pic:pic>
@@ -5114,7 +5159,7 @@
         <w:rPr>
           <w:rStyle w:val="VerbatimChar"/>
         </w:rPr>
-        <w:t xml:space="preserve">src/optimizer.py</w:t>
+        <w:t xml:space="preserve">src/template_code_project/core/optimizer.py</w:t>
       </w:r>
       <w:r>
         <w:t xml:space="preserve">, which calls the same</w:t>
@@ -13066,7 +13111,7 @@
         <w:t xml:space="preserve">Python</w:t>
       </w:r>
       <w:r>
-        <w:t xml:space="preserve">: 3.12.12</w:t>
+        <w:t xml:space="preserve">: 3.12.13</w:t>
       </w:r>
     </w:p>
     <w:p>
@@ -13123,7 +13168,7 @@
         <w:t xml:space="preserve">Generated</w:t>
       </w:r>
       <w:r>
-        <w:t xml:space="preserve">: 2026-08-14T14:20:53Z</w:t>
+        <w:t xml:space="preserve">: 2026-09-13T21:49:02Z</w:t>
       </w:r>
     </w:p>
     <w:bookmarkEnd w:id="109"/>
@@ -14360,7 +14405,7 @@
         <w:rPr>
           <w:rStyle w:val="VerbatimChar"/>
         </w:rPr>
-        <w:t xml:space="preserve">src/benchmark_support.py</w:t>
+        <w:t xml:space="preserve">src/template_code_project/core/benchmark_support.py</w:t>
       </w:r>
       <w:r>
         <w:t xml:space="preserve">, which evaluates the pure</w:t>
@@ -15036,7 +15081,7 @@
         <w:rPr>
           <w:rStyle w:val="VerbatimChar"/>
         </w:rPr>
-        <w:t xml:space="preserve">src/optimizer.py</w:t>
+        <w:t xml:space="preserve">src/template_code_project/core/optimizer.py</w:t>
       </w:r>
       <w:r>
         <w:t xml:space="preserve">; there is no Wolfe or Armijo backtracking.</w:t>

</xml_diff>

<commit_message>
render: regenerate 4 recovered exemplars (autopoiesis, code_project, pools_rules_tools, methods_paper)
</commit_message>
<xml_diff>
--- a/projects/templates/template_code_project/output/docx/template_code_project_combined.docx
+++ b/projects/templates/template_code_project/output/docx/template_code_project_combined.docx
@@ -13111,7 +13111,7 @@
         <w:t xml:space="preserve">Python</w:t>
       </w:r>
       <w:r>
-        <w:t xml:space="preserve">: 3.12.13</w:t>
+        <w:t xml:space="preserve">: 3.14.6</w:t>
       </w:r>
     </w:p>
     <w:p>
@@ -13130,7 +13130,7 @@
         <w:t xml:space="preserve">NumPy</w:t>
       </w:r>
       <w:r>
-        <w:t xml:space="preserve">: 2.4.2</w:t>
+        <w:t xml:space="preserve">: 2.4.1</w:t>
       </w:r>
     </w:p>
     <w:p>
@@ -13168,7 +13168,7 @@
         <w:t xml:space="preserve">Generated</w:t>
       </w:r>
       <w:r>
-        <w:t xml:space="preserve">: 2026-09-24T17:00:31Z</w:t>
+        <w:t xml:space="preserve">: 2026-09-25T17:57:57Z</w:t>
       </w:r>
     </w:p>
     <w:bookmarkEnd w:id="109"/>

</xml_diff>

<commit_message>
render: full receipt refresh against tracked ET manuscript (gitignore negation, 25/25 regenerated)
</commit_message>
<xml_diff>
--- a/projects/templates/template_code_project/output/docx/template_code_project_combined.docx
+++ b/projects/templates/template_code_project/output/docx/template_code_project_combined.docx
@@ -13130,7 +13130,7 @@
         <w:t xml:space="preserve">NumPy</w:t>
       </w:r>
       <w:r>
-        <w:t xml:space="preserve">: 2.4.1</w:t>
+        <w:t xml:space="preserve">: 2.4.2</w:t>
       </w:r>
     </w:p>
     <w:p>
@@ -13168,7 +13168,7 @@
         <w:t xml:space="preserve">Generated</w:t>
       </w:r>
       <w:r>
-        <w:t xml:space="preserve">: 2026-09-25T17:57:57Z</w:t>
+        <w:t xml:space="preserve">: 2026-09-25T23:57:58Z</w:t>
       </w:r>
     </w:p>
     <w:bookmarkEnd w:id="109"/>

</xml_diff>

<commit_message>
fix: repair render and rehearsal contracts
</commit_message>
<xml_diff>
--- a/projects/templates/template_code_project/output/docx/template_code_project_combined.docx
+++ b/projects/templates/template_code_project/output/docx/template_code_project_combined.docx
@@ -13130,7 +13130,7 @@
         <w:t xml:space="preserve">NumPy</w:t>
       </w:r>
       <w:r>
-        <w:t xml:space="preserve">: 2.4.2</w:t>
+        <w:t xml:space="preserve">: 2.4.1</w:t>
       </w:r>
     </w:p>
     <w:p>
@@ -13168,7 +13168,7 @@
         <w:t xml:space="preserve">Generated</w:t>
       </w:r>
       <w:r>
-        <w:t xml:space="preserve">: 2026-09-28T00:45:27Z</w:t>
+        <w:t xml:space="preserve">: 2026-09-28T17:16:20Z</w:t>
       </w:r>
     </w:p>
     <w:bookmarkEnd w:id="109"/>

</xml_diff>

<commit_message>
Remove obsolete API paths and renew public publication evidence
</commit_message>
<xml_diff>
--- a/projects/templates/template_code_project/output/docx/template_code_project_combined.docx
+++ b/projects/templates/template_code_project/output/docx/template_code_project_combined.docx
@@ -236,30 +236,6 @@
               <w:pStyle w:val="Compact"/>
             </w:pPr>
             <w:r>
-              <w:t xml:space="preserve">Version DOI</w:t>
-            </w:r>
-          </w:p>
-        </w:tc>
-        <w:tc>
-          <w:tcPr/>
-          <w:p>
-            <w:pPr>
-              <w:pStyle w:val="Compact"/>
-            </w:pPr>
-            <w:r>
-              <w:t xml:space="preserve">10.5281/zenodo.20931934</w:t>
-            </w:r>
-          </w:p>
-        </w:tc>
-      </w:tr>
-      <w:tr>
-        <w:tc>
-          <w:tcPr/>
-          <w:p>
-            <w:pPr>
-              <w:pStyle w:val="Compact"/>
-            </w:pPr>
-            <w:r>
               <w:t xml:space="preserve">GitHub</w:t>
             </w:r>
           </w:p>
@@ -1792,7 +1768,7 @@
         <w:t xml:space="preserve">Reporting &amp; Rendering</w:t>
       </w:r>
       <w:r>
-        <w:t xml:space="preserve">: Employing</w:t>
+        <w:t xml:space="preserve">: The project hydrates manuscript variables from its analysis outputs, then</w:t>
       </w:r>
       <w:r>
         <w:t xml:space="preserve"> </w:t>
@@ -1807,22 +1783,22 @@
         <w:t xml:space="preserve"> </w:t>
       </w:r>
       <w:r>
-        <w:t xml:space="preserve">and</w:t>
-      </w:r>
-      <w:r>
-        <w:t xml:space="preserve"> </w:t>
-      </w:r>
-      <w:r>
-        <w:rPr>
-          <w:rStyle w:val="VerbatimChar"/>
-        </w:rPr>
-        <w:t xml:space="preserve">infrastructure.reporting.executive_reporter</w:t>
-      </w:r>
-      <w:r>
-        <w:t xml:space="preserve"> </w:t>
-      </w:r>
-      <w:r>
-        <w:t xml:space="preserve">to automatically transform code outputs into this finalized manuscript.</w:t>
+        <w:t xml:space="preserve">compiles the manuscript. The supported</w:t>
+      </w:r>
+      <w:r>
+        <w:t xml:space="preserve"> </w:t>
+      </w:r>
+      <w:r>
+        <w:rPr>
+          <w:rStyle w:val="VerbatimChar"/>
+        </w:rPr>
+        <w:t xml:space="preserve">infrastructure.reporting</w:t>
+      </w:r>
+      <w:r>
+        <w:t xml:space="preserve"> </w:t>
+      </w:r>
+      <w:r>
+        <w:t xml:space="preserve">API produces separate pipeline and cross-project summaries.</w:t>
       </w:r>
     </w:p>
     <w:p>
@@ -4118,13 +4094,25 @@
         <w:rPr>
           <w:rStyle w:val="VerbatimChar"/>
         </w:rPr>
-        <w:t xml:space="preserve">_agency_category</w:t>
-      </w:r>
-      <w:r>
-        <w:t xml:space="preserve"> </w:t>
-      </w:r>
-      <w:r>
-        <w:t xml:space="preserve">in the analysis script):</w:t>
+        <w:t xml:space="preserve">agency_category</w:t>
+      </w:r>
+      <w:r>
+        <w:t xml:space="preserve"> </w:t>
+      </w:r>
+      <w:r>
+        <w:t xml:space="preserve">in</w:t>
+      </w:r>
+      <w:r>
+        <w:t xml:space="preserve"> </w:t>
+      </w:r>
+      <w:r>
+        <w:rPr>
+          <w:rStyle w:val="VerbatimChar"/>
+        </w:rPr>
+        <w:t xml:space="preserve">template_code_project.figures.viz_config</w:t>
+      </w:r>
+      <w:r>
+        <w:t xml:space="preserve">):</w:t>
       </w:r>
       <w:r>
         <w:t xml:space="preserve"> </w:t>
@@ -6342,7 +6330,46 @@
         <w:pStyle w:val="FirstParagraph"/>
       </w:pPr>
       <w:r>
-        <w:t xml:space="preserve">The optimization results for different step sizes are synthesized computationally by orchestrating</w:t>
+        <w:t xml:space="preserve">The optimization analysis writes</w:t>
+      </w:r>
+      <w:r>
+        <w:t xml:space="preserve"> </w:t>
+      </w:r>
+      <w:r>
+        <w:rPr>
+          <w:rStyle w:val="VerbatimChar"/>
+        </w:rPr>
+        <w:t xml:space="preserve">output/data/optimization_results.csv</w:t>
+      </w:r>
+      <w:r>
+        <w:t xml:space="preserve"> </w:t>
+      </w:r>
+      <w:r>
+        <w:t xml:space="preserve">through</w:t>
+      </w:r>
+      <w:r>
+        <w:t xml:space="preserve"> </w:t>
+      </w:r>
+      <w:r>
+        <w:rPr>
+          <w:rStyle w:val="VerbatimChar"/>
+        </w:rPr>
+        <w:t xml:space="preserve">template_code_project.analysis.experiments.save_optimization_results</w:t>
+      </w:r>
+      <w:r>
+        <w:t xml:space="preserve">, orchestrated by</w:t>
+      </w:r>
+      <w:r>
+        <w:t xml:space="preserve"> </w:t>
+      </w:r>
+      <w:r>
+        <w:rPr>
+          <w:rStyle w:val="VerbatimChar"/>
+        </w:rPr>
+        <w:t xml:space="preserve">projects/templates/template_code_project/scripts/optimization_analysis.py</w:t>
+      </w:r>
+      <w:r>
+        <w:t xml:space="preserve">. That CSV is the source of truth for tbl. 1; the supported</w:t>
       </w:r>
       <w:r>
         <w:t xml:space="preserve"> </w:t>
@@ -6352,38 +6379,14 @@
           <w:rPr>
             <w:rStyle w:val="VerbatimChar"/>
           </w:rPr>
-          <w:t xml:space="preserve">infrastructure.reporting.executive_reporter</w:t>
+          <w:t xml:space="preserve">infrastructure.reporting</w:t>
         </w:r>
       </w:hyperlink>
       <w:r>
-        <w:t xml:space="preserve">, feeding directly into</w:t>
-      </w:r>
-      <w:r>
-        <w:t xml:space="preserve"> </w:t>
-      </w:r>
-      <w:r>
-        <w:rPr>
-          <w:rStyle w:val="VerbatimChar"/>
-        </w:rPr>
-        <w:t xml:space="preserve">output/data/optimization_results.csv</w:t>
-      </w:r>
-      <w:r>
-        <w:t xml:space="preserve"> </w:t>
-      </w:r>
-      <w:r>
-        <w:t xml:space="preserve">(generated by</w:t>
-      </w:r>
-      <w:r>
-        <w:t xml:space="preserve"> </w:t>
-      </w:r>
-      <w:r>
-        <w:rPr>
-          <w:rStyle w:val="VerbatimChar"/>
-        </w:rPr>
-        <w:t xml:space="preserve">projects/templates/template_code_project/scripts/optimization_analysis.py</w:t>
-      </w:r>
-      <w:r>
-        <w:t xml:space="preserve">) as the source of truth for tbl. 1. Rows follow</w:t>
+        <w:t xml:space="preserve"> </w:t>
+      </w:r>
+      <w:r>
+        <w:t xml:space="preserve">API supplies reusable pipeline and cross-project summaries. Rows follow</w:t>
       </w:r>
       <w:r>
         <w:t xml:space="preserve"> </w:t>
@@ -12727,22 +12730,22 @@
         <w:t xml:space="preserve">Reporting &amp; Integrity</w:t>
       </w:r>
       <w:r>
-        <w:t xml:space="preserve">:</w:t>
-      </w:r>
-      <w:r>
-        <w:t xml:space="preserve"> </w:t>
-      </w:r>
-      <w:r>
-        <w:rPr>
-          <w:rStyle w:val="VerbatimChar"/>
-        </w:rPr>
-        <w:t xml:space="preserve">infrastructure.reporting.executive_reporter</w:t>
-      </w:r>
-      <w:r>
-        <w:t xml:space="preserve"> </w:t>
-      </w:r>
-      <w:r>
-        <w:t xml:space="preserve">and</w:t>
+        <w:t xml:space="preserve">: the supported</w:t>
+      </w:r>
+      <w:r>
+        <w:t xml:space="preserve"> </w:t>
+      </w:r>
+      <w:r>
+        <w:rPr>
+          <w:rStyle w:val="VerbatimChar"/>
+        </w:rPr>
+        <w:t xml:space="preserve">infrastructure.reporting</w:t>
+      </w:r>
+      <w:r>
+        <w:t xml:space="preserve"> </w:t>
+      </w:r>
+      <w:r>
+        <w:t xml:space="preserve">summary API and</w:t>
       </w:r>
       <w:r>
         <w:t xml:space="preserve"> </w:t>
@@ -12757,7 +12760,7 @@
         <w:t xml:space="preserve"> </w:t>
       </w:r>
       <w:r>
-        <w:t xml:space="preserve">assuring CSV/JSON configurations conform.</w:t>
+        <w:t xml:space="preserve">for output diagnostics.</w:t>
       </w:r>
     </w:p>
     <w:p>
@@ -14131,7 +14134,7 @@
         <w:t xml:space="preserve">Python</w:t>
       </w:r>
       <w:r>
-        <w:t xml:space="preserve">: 3.14.4</w:t>
+        <w:t xml:space="preserve">: 3.12.13</w:t>
       </w:r>
     </w:p>
     <w:p>
@@ -14188,7 +14191,7 @@
         <w:t xml:space="preserve">Generated</w:t>
       </w:r>
       <w:r>
-        <w:t xml:space="preserve">: 2026-10-14T00:59:41Z</w:t>
+        <w:t xml:space="preserve">: 2026-10-14T14:49:00Z</w:t>
       </w:r>
     </w:p>
     <w:p>

</xml_diff>

<commit_message>
Fix hosted CI preparation and regenerate 4.0.2 publications
Prepare genuine document tools and the exact offline Root wheel cache in CI,
retain cold native diagnostics, and consistently select the Node 24 profile.
Preserve nested test clocks while matching the declared parent pytest limits.

Regenerate six affected publications through their canonical producers, renew
reviewed case policy bindings, reconcile current version documentation, and
refresh all public validation/provenance receipts.
</commit_message>
<xml_diff>
--- a/projects/templates/template_code_project/output/docx/template_code_project_combined.docx
+++ b/projects/templates/template_code_project/output/docx/template_code_project_combined.docx
@@ -14134,7 +14134,7 @@
         <w:t xml:space="preserve">Python</w:t>
       </w:r>
       <w:r>
-        <w:t xml:space="preserve">: 3.12.13</w:t>
+        <w:t xml:space="preserve">: 3.14.4</w:t>
       </w:r>
     </w:p>
     <w:p>
@@ -14153,7 +14153,7 @@
         <w:t xml:space="preserve">NumPy</w:t>
       </w:r>
       <w:r>
-        <w:t xml:space="preserve">: 2.4.2</w:t>
+        <w:t xml:space="preserve">: 2.4.1</w:t>
       </w:r>
     </w:p>
     <w:p>
@@ -14191,7 +14191,7 @@
         <w:t xml:space="preserve">Generated</w:t>
       </w:r>
       <w:r>
-        <w:t xml:space="preserve">: 2026-10-14T14:49:00Z</w:t>
+        <w:t xml:space="preserve">: 2026-10-15T18:40:52Z</w:t>
       </w:r>
     </w:p>
     <w:p>
@@ -14837,7 +14837,7 @@
               <w:rPr>
                 <w:rStyle w:val="VerbatimChar"/>
               </w:rPr>
-              <w:t xml:space="preserve">55b948844dfd7b70</w:t>
+              <w:t xml:space="preserve">f8ebf4554f853abe</w:t>
             </w:r>
           </w:p>
         </w:tc>

</xml_diff>

<commit_message>
Integrate reviewed 4.1 publication corrections
</commit_message>
<xml_diff>
--- a/projects/templates/template_code_project/output/docx/template_code_project_combined.docx
+++ b/projects/templates/template_code_project/output/docx/template_code_project_combined.docx
@@ -14134,7 +14134,7 @@
         <w:t xml:space="preserve">Python</w:t>
       </w:r>
       <w:r>
-        <w:t xml:space="preserve">: 3.14.4</w:t>
+        <w:t xml:space="preserve">: 3.14.8</w:t>
       </w:r>
     </w:p>
     <w:p>
@@ -14153,7 +14153,7 @@
         <w:t xml:space="preserve">NumPy</w:t>
       </w:r>
       <w:r>
-        <w:t xml:space="preserve">: 2.4.1</w:t>
+        <w:t xml:space="preserve">: 2.4.2</w:t>
       </w:r>
     </w:p>
     <w:p>
@@ -14191,7 +14191,7 @@
         <w:t xml:space="preserve">Generated</w:t>
       </w:r>
       <w:r>
-        <w:t xml:space="preserve">: 2026-10-15T18:40:52Z</w:t>
+        <w:t xml:space="preserve">: 2026-10-22T17:22:44Z</w:t>
       </w:r>
     </w:p>
     <w:p>
@@ -14837,7 +14837,7 @@
               <w:rPr>
                 <w:rStyle w:val="VerbatimChar"/>
               </w:rPr>
-              <w:t xml:space="preserve">f8ebf4554f853abe</w:t>
+              <w:t xml:space="preserve">4bc0e13a7db36799</w:t>
             </w:r>
           </w:p>
         </w:tc>

</xml_diff>

<commit_message>
fix: refine public template layouts and standalone dashboards
</commit_message>
<xml_diff>
--- a/projects/templates/template_code_project/output/docx/template_code_project_combined.docx
+++ b/projects/templates/template_code_project/output/docx/template_code_project_combined.docx
@@ -9983,7 +9983,7 @@
           <wp:inline>
             <wp:extent cx="5334000" cy="6237349"/>
             <wp:effectExtent b="0" l="0" r="0" t="0"/>
-            <wp:docPr descr="Figure 4: Six-panel diagnostic from generate_complexity_visualization() (3×2 grid). Top left: bars give the empirical iteration count per configured \alpha, coloured by agency category; \alpha=1.0 achieves the global minimum of 1 step(s), while \alpha=0.01 saturates at the iteration cap N_{\max}=1000 (slow convergence) and \alpha=2.5 terminates early via a non_finite update (divergence). Top right: \log_{10}|f(x)-f(x^\ast)| at termination; the four converged rows reach \approx 10^{-16} (machine precision) while \alpha=0.01 stops near 10^{-9} at the cap. Dashed reference at \log_{10}\varepsilon for \varepsilon= experiment.convergence_tolerance. Middle left: empirical iterations (solid) versus the smooth proxy 1/(2\alpha(1-\alpha)) (dashed) on log axes — a shape comparison, not a tight count prediction for every \alpha. Middle right: per-step error contraction factor \rho=|1-\alpha| from the unit-Hessian linear recurrence (eq. 4); the dashed reference at \rho=1 separates stable bars (left of it) from divergent ones (right). Bottom left: stable step-size region width 2/L per backend profile (H=I,2I,5I,10I) with the optimal \alpha^\ast=1/L overlaid. Bottom right: cross-profile contraction curves \rho(\alpha)=|1-\alpha L| with dotted verticals at each 2/L stability boundary." title="" id="88" name="Picture"/>
+            <wp:docPr descr="Figure 4: Six-panel diagnostic from generate_complexity_visualization() (3×2 grid)." title="" id="88" name="Picture"/>
             <a:graphic>
               <a:graphicData uri="http://schemas.openxmlformats.org/drawingml/2006/picture">
                 <pic:pic>
@@ -10043,9 +10043,24 @@
       <w:r>
         <w:t xml:space="preserve">(3×2 grid).</w:t>
       </w:r>
-      <w:r>
-        <w:t xml:space="preserve"> </w:t>
-      </w:r>
+    </w:p>
+    <w:bookmarkEnd w:id="90"/>
+    <w:p>
+      <w:pPr>
+        <w:pStyle w:val="FirstParagraph"/>
+      </w:pPr>
+      <w:r>
+        <w:t xml:space="preserve">The panels in fig. 4 encode the following diagnostics:</w:t>
+      </w:r>
+    </w:p>
+    <w:p>
+      <w:pPr>
+        <w:pStyle w:val="Compact"/>
+        <w:numPr>
+          <w:ilvl w:val="0"/>
+          <w:numId w:val="1016"/>
+        </w:numPr>
+      </w:pPr>
       <w:r>
         <w:rPr>
           <w:b/>
@@ -10186,9 +10201,15 @@
       <w:r>
         <w:t xml:space="preserve">update (divergence).</w:t>
       </w:r>
-      <w:r>
-        <w:t xml:space="preserve"> </w:t>
-      </w:r>
+    </w:p>
+    <w:p>
+      <w:pPr>
+        <w:pStyle w:val="Compact"/>
+        <w:numPr>
+          <w:ilvl w:val="0"/>
+          <w:numId w:val="1016"/>
+        </w:numPr>
+      </w:pPr>
       <w:r>
         <w:rPr>
           <w:b/>
@@ -10433,9 +10454,15 @@
       <w:r>
         <w:t xml:space="preserve">.</w:t>
       </w:r>
-      <w:r>
-        <w:t xml:space="preserve"> </w:t>
-      </w:r>
+    </w:p>
+    <w:p>
+      <w:pPr>
+        <w:pStyle w:val="Compact"/>
+        <w:numPr>
+          <w:ilvl w:val="0"/>
+          <w:numId w:val="1016"/>
+        </w:numPr>
+      </w:pPr>
       <w:r>
         <w:rPr>
           <w:b/>
@@ -10519,9 +10546,15 @@
       <w:r>
         <w:t xml:space="preserve">.</w:t>
       </w:r>
-      <w:r>
-        <w:t xml:space="preserve"> </w:t>
-      </w:r>
+    </w:p>
+    <w:p>
+      <w:pPr>
+        <w:pStyle w:val="Compact"/>
+        <w:numPr>
+          <w:ilvl w:val="0"/>
+          <w:numId w:val="1016"/>
+        </w:numPr>
+      </w:pPr>
       <w:r>
         <w:rPr>
           <w:b/>
@@ -10599,9 +10632,15 @@
       <w:r>
         <w:t xml:space="preserve">separates stable bars (left of it) from divergent ones (right).</w:t>
       </w:r>
-      <w:r>
-        <w:t xml:space="preserve"> </w:t>
-      </w:r>
+    </w:p>
+    <w:p>
+      <w:pPr>
+        <w:pStyle w:val="Compact"/>
+        <w:numPr>
+          <w:ilvl w:val="0"/>
+          <w:numId w:val="1016"/>
+        </w:numPr>
+      </w:pPr>
       <w:r>
         <w:rPr>
           <w:b/>
@@ -10732,113 +10771,6 @@
       <w:r>
         <w:t xml:space="preserve">overlaid.</w:t>
       </w:r>
-      <w:r>
-        <w:t xml:space="preserve"> </w:t>
-      </w:r>
-      <w:r>
-        <w:rPr>
-          <w:b/>
-          <w:bCs/>
-        </w:rPr>
-        <w:t xml:space="preserve">Bottom right</w:t>
-      </w:r>
-      <w:r>
-        <w:t xml:space="preserve">: cross-profile contraction curves</w:t>
-      </w:r>
-      <w:r>
-        <w:t xml:space="preserve"> </w:t>
-      </w:r>
-      <m:oMath>
-        <m:r>
-          <m:t>ρ</m:t>
-        </m:r>
-        <m:r>
-          <m:rPr>
-            <m:sty m:val="p"/>
-          </m:rPr>
-          <m:t>(</m:t>
-        </m:r>
-        <m:r>
-          <m:t>α</m:t>
-        </m:r>
-        <m:r>
-          <m:rPr>
-            <m:sty m:val="p"/>
-          </m:rPr>
-          <m:t>)</m:t>
-        </m:r>
-        <m:r>
-          <m:rPr>
-            <m:sty m:val="p"/>
-          </m:rPr>
-          <m:t>=</m:t>
-        </m:r>
-        <m:r>
-          <m:rPr>
-            <m:sty m:val="p"/>
-          </m:rPr>
-          <m:t>|</m:t>
-        </m:r>
-        <m:r>
-          <m:t>1</m:t>
-        </m:r>
-        <m:r>
-          <m:rPr>
-            <m:sty m:val="p"/>
-          </m:rPr>
-          <m:t>−</m:t>
-        </m:r>
-        <m:r>
-          <m:t>α</m:t>
-        </m:r>
-        <m:r>
-          <m:t>L</m:t>
-        </m:r>
-        <m:r>
-          <m:rPr>
-            <m:sty m:val="p"/>
-          </m:rPr>
-          <m:t>|</m:t>
-        </m:r>
-      </m:oMath>
-      <w:r>
-        <w:t xml:space="preserve"> </w:t>
-      </w:r>
-      <w:r>
-        <w:t xml:space="preserve">with dotted verticals at each</w:t>
-      </w:r>
-      <w:r>
-        <w:t xml:space="preserve"> </w:t>
-      </w:r>
-      <m:oMath>
-        <m:r>
-          <m:t>2</m:t>
-        </m:r>
-        <m:r>
-          <m:rPr>
-            <m:sty m:val="p"/>
-          </m:rPr>
-          <m:t>/</m:t>
-        </m:r>
-        <m:r>
-          <m:t>L</m:t>
-        </m:r>
-      </m:oMath>
-      <w:r>
-        <w:t xml:space="preserve"> </w:t>
-      </w:r>
-      <w:r>
-        <w:t xml:space="preserve">stability boundary.</w:t>
-      </w:r>
-    </w:p>
-    <w:bookmarkEnd w:id="90"/>
-    <w:p>
-      <w:pPr>
-        <w:pStyle w:val="FirstParagraph"/>
-      </w:pPr>
-      <w:r>
-        <w:t xml:space="preserve">The algorithm demonstrates efficient performance for small-scale optimization problems:</w:t>
-      </w:r>
     </w:p>
     <w:p>
       <w:pPr>
@@ -10853,17 +10785,17 @@
           <w:b/>
           <w:bCs/>
         </w:rPr>
-        <w:t xml:space="preserve">Time complexity</w:t>
-      </w:r>
-      <w:r>
-        <w:t xml:space="preserve">:</w:t>
-      </w:r>
-      <w:r>
-        <w:t xml:space="preserve"> </w:t>
-      </w:r>
-      <m:oMath>
-        <m:r>
-          <m:t>O</m:t>
+        <w:t xml:space="preserve">Bottom right</w:t>
+      </w:r>
+      <w:r>
+        <w:t xml:space="preserve">: cross-profile contraction curves</w:t>
+      </w:r>
+      <w:r>
+        <w:t xml:space="preserve"> </w:t>
+      </w:r>
+      <m:oMath>
+        <m:r>
+          <m:t>ρ</m:t>
         </m:r>
         <m:r>
           <m:rPr>
@@ -10872,7 +10804,7 @@
           <m:t>(</m:t>
         </m:r>
         <m:r>
-          <m:t>d</m:t>
+          <m:t>α</m:t>
         </m:r>
         <m:r>
           <m:rPr>
@@ -10880,12 +10812,76 @@
           </m:rPr>
           <m:t>)</m:t>
         </m:r>
-      </m:oMath>
-      <w:r>
-        <w:t xml:space="preserve"> </w:t>
-      </w:r>
-      <w:r>
-        <w:t xml:space="preserve">per iteration for gradient computation</w:t>
+        <m:r>
+          <m:rPr>
+            <m:sty m:val="p"/>
+          </m:rPr>
+          <m:t>=</m:t>
+        </m:r>
+        <m:r>
+          <m:rPr>
+            <m:sty m:val="p"/>
+          </m:rPr>
+          <m:t>|</m:t>
+        </m:r>
+        <m:r>
+          <m:t>1</m:t>
+        </m:r>
+        <m:r>
+          <m:rPr>
+            <m:sty m:val="p"/>
+          </m:rPr>
+          <m:t>−</m:t>
+        </m:r>
+        <m:r>
+          <m:t>α</m:t>
+        </m:r>
+        <m:r>
+          <m:t>L</m:t>
+        </m:r>
+        <m:r>
+          <m:rPr>
+            <m:sty m:val="p"/>
+          </m:rPr>
+          <m:t>|</m:t>
+        </m:r>
+      </m:oMath>
+      <w:r>
+        <w:t xml:space="preserve"> </w:t>
+      </w:r>
+      <w:r>
+        <w:t xml:space="preserve">with dotted verticals at each</w:t>
+      </w:r>
+      <w:r>
+        <w:t xml:space="preserve"> </w:t>
+      </w:r>
+      <m:oMath>
+        <m:r>
+          <m:t>2</m:t>
+        </m:r>
+        <m:r>
+          <m:rPr>
+            <m:sty m:val="p"/>
+          </m:rPr>
+          <m:t>/</m:t>
+        </m:r>
+        <m:r>
+          <m:t>L</m:t>
+        </m:r>
+      </m:oMath>
+      <w:r>
+        <w:t xml:space="preserve"> </w:t>
+      </w:r>
+      <w:r>
+        <w:t xml:space="preserve">stability boundary.</w:t>
+      </w:r>
+    </w:p>
+    <w:p>
+      <w:pPr>
+        <w:pStyle w:val="FirstParagraph"/>
+      </w:pPr>
+      <w:r>
+        <w:t xml:space="preserve">The algorithm demonstrates efficient performance for small-scale optimization problems:</w:t>
       </w:r>
     </w:p>
     <w:p>
@@ -10893,7 +10889,7 @@
         <w:pStyle w:val="Compact"/>
         <w:numPr>
           <w:ilvl w:val="0"/>
-          <w:numId w:val="1016"/>
+          <w:numId w:val="1017"/>
         </w:numPr>
       </w:pPr>
       <w:r>
@@ -10901,7 +10897,7 @@
           <w:b/>
           <w:bCs/>
         </w:rPr>
-        <w:t xml:space="preserve">Space complexity</w:t>
+        <w:t xml:space="preserve">Time complexity</w:t>
       </w:r>
       <w:r>
         <w:t xml:space="preserve">:</w:t>
@@ -10933,7 +10929,7 @@
         <w:t xml:space="preserve"> </w:t>
       </w:r>
       <w:r>
-        <w:t xml:space="preserve">for storing variables and gradients</w:t>
+        <w:t xml:space="preserve">per iteration for gradient computation</w:t>
       </w:r>
     </w:p>
     <w:p>
@@ -10941,7 +10937,7 @@
         <w:pStyle w:val="Compact"/>
         <w:numPr>
           <w:ilvl w:val="0"/>
-          <w:numId w:val="1016"/>
+          <w:numId w:val="1017"/>
         </w:numPr>
       </w:pPr>
       <w:r>
@@ -10949,33 +10945,39 @@
           <w:b/>
           <w:bCs/>
         </w:rPr>
-        <w:t xml:space="preserve">Convergence</w:t>
-      </w:r>
-      <w:r>
-        <w:t xml:space="preserve">: Fastest at</w:t>
-      </w:r>
-      <w:r>
-        <w:t xml:space="preserve"> </w:t>
-      </w:r>
-      <m:oMath>
-        <m:r>
-          <m:t>α</m:t>
-        </m:r>
-        <m:r>
-          <m:rPr>
-            <m:sty m:val="p"/>
-          </m:rPr>
-          <m:t>=</m:t>
-        </m:r>
-        <m:r>
-          <m:t>1.0</m:t>
-        </m:r>
-      </m:oMath>
-      <w:r>
-        <w:t xml:space="preserve"> </w:t>
-      </w:r>
-      <w:r>
-        <w:t xml:space="preserve">(1 iteration), average 351 iterations</w:t>
+        <w:t xml:space="preserve">Space complexity</w:t>
+      </w:r>
+      <w:r>
+        <w:t xml:space="preserve">:</w:t>
+      </w:r>
+      <w:r>
+        <w:t xml:space="preserve"> </w:t>
+      </w:r>
+      <m:oMath>
+        <m:r>
+          <m:t>O</m:t>
+        </m:r>
+        <m:r>
+          <m:rPr>
+            <m:sty m:val="p"/>
+          </m:rPr>
+          <m:t>(</m:t>
+        </m:r>
+        <m:r>
+          <m:t>d</m:t>
+        </m:r>
+        <m:r>
+          <m:rPr>
+            <m:sty m:val="p"/>
+          </m:rPr>
+          <m:t>)</m:t>
+        </m:r>
+      </m:oMath>
+      <w:r>
+        <w:t xml:space="preserve"> </w:t>
+      </w:r>
+      <w:r>
+        <w:t xml:space="preserve">for storing variables and gradients</w:t>
       </w:r>
     </w:p>
     <w:p>
@@ -10983,7 +10985,49 @@
         <w:pStyle w:val="Compact"/>
         <w:numPr>
           <w:ilvl w:val="0"/>
-          <w:numId w:val="1016"/>
+          <w:numId w:val="1017"/>
+        </w:numPr>
+      </w:pPr>
+      <w:r>
+        <w:rPr>
+          <w:b/>
+          <w:bCs/>
+        </w:rPr>
+        <w:t xml:space="preserve">Convergence</w:t>
+      </w:r>
+      <w:r>
+        <w:t xml:space="preserve">: Fastest at</w:t>
+      </w:r>
+      <w:r>
+        <w:t xml:space="preserve"> </w:t>
+      </w:r>
+      <m:oMath>
+        <m:r>
+          <m:t>α</m:t>
+        </m:r>
+        <m:r>
+          <m:rPr>
+            <m:sty m:val="p"/>
+          </m:rPr>
+          <m:t>=</m:t>
+        </m:r>
+        <m:r>
+          <m:t>1.0</m:t>
+        </m:r>
+      </m:oMath>
+      <w:r>
+        <w:t xml:space="preserve"> </w:t>
+      </w:r>
+      <w:r>
+        <w:t xml:space="preserve">(1 iteration), average 351 iterations</w:t>
+      </w:r>
+    </w:p>
+    <w:p>
+      <w:pPr>
+        <w:pStyle w:val="Compact"/>
+        <w:numPr>
+          <w:ilvl w:val="0"/>
+          <w:numId w:val="1017"/>
         </w:numPr>
       </w:pPr>
       <w:r>
@@ -12007,47 +12051,11 @@
         <w:pStyle w:val="Compact"/>
         <w:numPr>
           <w:ilvl w:val="0"/>
-          <w:numId w:val="1017"/>
+          <w:numId w:val="1018"/>
         </w:numPr>
       </w:pPr>
       <w:r>
         <w:t xml:space="preserve">Smallest iteration count recorded: 1</w:t>
-      </w:r>
-    </w:p>
-    <w:p>
-      <w:pPr>
-        <w:pStyle w:val="Compact"/>
-        <w:numPr>
-          <w:ilvl w:val="0"/>
-          <w:numId w:val="1017"/>
-        </w:numPr>
-      </w:pPr>
-      <w:r>
-        <w:t xml:space="preserve">Largest iteration count recorded: 1000</w:t>
-      </w:r>
-    </w:p>
-    <w:p>
-      <w:pPr>
-        <w:pStyle w:val="Compact"/>
-        <w:numPr>
-          <w:ilvl w:val="0"/>
-          <w:numId w:val="1017"/>
-        </w:numPr>
-      </w:pPr>
-      <w:r>
-        <w:t xml:space="preserve">Mean iterations across rows in tbl. 1: 351</w:t>
-      </w:r>
-    </w:p>
-    <w:p>
-      <w:pPr>
-        <w:pStyle w:val="FirstParagraph"/>
-      </w:pPr>
-      <w:r>
-        <w:rPr>
-          <w:b/>
-          <w:bCs/>
-        </w:rPr>
-        <w:t xml:space="preserve">Numerical Accuracy:</w:t>
       </w:r>
     </w:p>
     <w:p>
@@ -12056,6 +12064,42 @@
         <w:numPr>
           <w:ilvl w:val="0"/>
           <w:numId w:val="1018"/>
+        </w:numPr>
+      </w:pPr>
+      <w:r>
+        <w:t xml:space="preserve">Largest iteration count recorded: 1000</w:t>
+      </w:r>
+    </w:p>
+    <w:p>
+      <w:pPr>
+        <w:pStyle w:val="Compact"/>
+        <w:numPr>
+          <w:ilvl w:val="0"/>
+          <w:numId w:val="1018"/>
+        </w:numPr>
+      </w:pPr>
+      <w:r>
+        <w:t xml:space="preserve">Mean iterations across rows in tbl. 1: 351</w:t>
+      </w:r>
+    </w:p>
+    <w:p>
+      <w:pPr>
+        <w:pStyle w:val="FirstParagraph"/>
+      </w:pPr>
+      <w:r>
+        <w:rPr>
+          <w:b/>
+          <w:bCs/>
+        </w:rPr>
+        <w:t xml:space="preserve">Numerical Accuracy:</w:t>
+      </w:r>
+    </w:p>
+    <w:p>
+      <w:pPr>
+        <w:pStyle w:val="Compact"/>
+        <w:numPr>
+          <w:ilvl w:val="0"/>
+          <w:numId w:val="1019"/>
         </w:numPr>
       </w:pPr>
       <w:r>
@@ -12102,7 +12146,7 @@
         <w:pStyle w:val="Compact"/>
         <w:numPr>
           <w:ilvl w:val="0"/>
-          <w:numId w:val="1018"/>
+          <w:numId w:val="1019"/>
         </w:numPr>
       </w:pPr>
       <w:r>
@@ -12149,7 +12193,7 @@
         <w:pStyle w:val="Compact"/>
         <w:numPr>
           <w:ilvl w:val="0"/>
-          <w:numId w:val="1018"/>
+          <w:numId w:val="1019"/>
         </w:numPr>
       </w:pPr>
       <w:r>
@@ -12229,7 +12273,7 @@
         <w:pStyle w:val="Compact"/>
         <w:numPr>
           <w:ilvl w:val="0"/>
-          <w:numId w:val="1019"/>
+          <w:numId w:val="1020"/>
         </w:numPr>
       </w:pPr>
       <w:r>
@@ -12244,243 +12288,6 @@
       </w:r>
       <w:r>
         <w:t xml:space="preserve">verifying algorithm convergence and visualization pipelines.</w:t>
-      </w:r>
-    </w:p>
-    <w:p>
-      <w:pPr>
-        <w:pStyle w:val="Compact"/>
-        <w:numPr>
-          <w:ilvl w:val="0"/>
-          <w:numId w:val="1019"/>
-        </w:numPr>
-      </w:pPr>
-      <w:r>
-        <w:rPr>
-          <w:b/>
-          <w:bCs/>
-        </w:rPr>
-        <w:t xml:space="preserve">Infrastructure tests</w:t>
-      </w:r>
-      <w:r>
-        <w:t xml:space="preserve"> </w:t>
-      </w:r>
-      <w:r>
-        <w:t xml:space="preserve">covering all underlying mechanisms across</w:t>
-      </w:r>
-      <w:r>
-        <w:t xml:space="preserve"> </w:t>
-      </w:r>
-      <w:r>
-        <w:rPr>
-          <w:rStyle w:val="VerbatimChar"/>
-        </w:rPr>
-        <w:t xml:space="preserve">infrastructure.reporting</w:t>
-      </w:r>
-      <w:r>
-        <w:t xml:space="preserve">,</w:t>
-      </w:r>
-      <w:r>
-        <w:t xml:space="preserve"> </w:t>
-      </w:r>
-      <w:r>
-        <w:rPr>
-          <w:rStyle w:val="VerbatimChar"/>
-        </w:rPr>
-        <w:t xml:space="preserve">infrastructure.validation</w:t>
-      </w:r>
-      <w:r>
-        <w:t xml:space="preserve">, and</w:t>
-      </w:r>
-      <w:r>
-        <w:t xml:space="preserve"> </w:t>
-      </w:r>
-      <w:r>
-        <w:rPr>
-          <w:rStyle w:val="VerbatimChar"/>
-        </w:rPr>
-        <w:t xml:space="preserve">infrastructure.rendering</w:t>
-      </w:r>
-      <w:r>
-        <w:t xml:space="preserve">.</w:t>
-      </w:r>
-    </w:p>
-    <w:p>
-      <w:pPr>
-        <w:pStyle w:val="Compact"/>
-        <w:numPr>
-          <w:ilvl w:val="0"/>
-          <w:numId w:val="1019"/>
-        </w:numPr>
-      </w:pPr>
-      <w:r>
-        <w:rPr>
-          <w:b/>
-          <w:bCs/>
-        </w:rPr>
-        <w:t xml:space="preserve">Numerical accuracy</w:t>
-      </w:r>
-      <w:r>
-        <w:t xml:space="preserve"> </w:t>
-      </w:r>
-      <w:r>
-        <w:t xml:space="preserve">checks verified systematically using PyTest.</w:t>
-      </w:r>
-    </w:p>
-    <w:p>
-      <w:pPr>
-        <w:pStyle w:val="FirstParagraph"/>
-      </w:pPr>
-      <w:r>
-        <w:t xml:space="preserve">Passing the declared suite and its 90% coverage floor provides evidence for the tested core logic, convergence detection, and logging pathways. It does not prove correctness for every input or replace scientific validation.</w:t>
-      </w:r>
-    </w:p>
-    <w:p>
-      <w:pPr>
-        <w:pStyle w:val="Heading2"/>
-      </w:pPr>
-      <w:bookmarkStart w:id="103" w:name="_discussion"/>
-      <w:r>
-        <w:t xml:space="preserve">Discussion</w:t>
-      </w:r>
-      <w:bookmarkEnd w:id="103"/>
-    </w:p>
-    <w:p>
-      <w:pPr>
-        <w:pStyle w:val="FirstParagraph"/>
-      </w:pPr>
-      <w:r>
-        <w:t xml:space="preserve">The configured results distinguish convergence, iteration-cap termination, and non-finite updates. Iteration counts are not monotonic in step size: the unit-Hessian contraction factor</w:t>
-      </w:r>
-      <w:r>
-        <w:t xml:space="preserve"> </w:t>
-      </w:r>
-      <m:oMath>
-        <m:r>
-          <m:t>ρ</m:t>
-        </m:r>
-        <m:r>
-          <m:rPr>
-            <m:sty m:val="p"/>
-          </m:rPr>
-          <m:t>(</m:t>
-        </m:r>
-        <m:r>
-          <m:t>α</m:t>
-        </m:r>
-        <m:r>
-          <m:rPr>
-            <m:sty m:val="p"/>
-          </m:rPr>
-          <m:t>)</m:t>
-        </m:r>
-        <m:r>
-          <m:rPr>
-            <m:sty m:val="p"/>
-          </m:rPr>
-          <m:t>=</m:t>
-        </m:r>
-        <m:r>
-          <m:rPr>
-            <m:sty m:val="p"/>
-          </m:rPr>
-          <m:t>|</m:t>
-        </m:r>
-        <m:r>
-          <m:t>1</m:t>
-        </m:r>
-        <m:r>
-          <m:rPr>
-            <m:sty m:val="p"/>
-          </m:rPr>
-          <m:t>−</m:t>
-        </m:r>
-        <m:r>
-          <m:t>α</m:t>
-        </m:r>
-        <m:r>
-          <m:rPr>
-            <m:sty m:val="p"/>
-          </m:rPr>
-          <m:t>|</m:t>
-        </m:r>
-      </m:oMath>
-      <w:r>
-        <w:t xml:space="preserve"> </w:t>
-      </w:r>
-      <w:r>
-        <w:t xml:space="preserve">decreases toward</w:t>
-      </w:r>
-      <w:r>
-        <w:t xml:space="preserve"> </w:t>
-      </w:r>
-      <m:oMath>
-        <m:r>
-          <m:t>α</m:t>
-        </m:r>
-        <m:r>
-          <m:rPr>
-            <m:sty m:val="p"/>
-          </m:rPr>
-          <m:t>=</m:t>
-        </m:r>
-        <m:r>
-          <m:t>1</m:t>
-        </m:r>
-      </m:oMath>
-      <w:r>
-        <w:t xml:space="preserve"> </w:t>
-      </w:r>
-      <w:r>
-        <w:t xml:space="preserve">and increases afterward. Accuracy claims apply to converged rows; capped and unstable runs must retain their termination status. The generated table and figures document this finite sweep, not all possible objectives or parameter choices. The analysis pipeline integrates those results into manuscript outputs through the declared configuration and variable injection.</w:t>
-      </w:r>
-    </w:p>
-    <w:p>
-      <w:pPr>
-        <w:pStyle w:val="BodyText"/>
-      </w:pPr>
-      <w:r>
-        <w:t xml:space="preserve">Successful generation and reference resolution establish this artifact path for the tested candidate; they do not establish absolute renderer reliability or replace visual inspection of its output.</w:t>
-      </w:r>
-    </w:p>
-    <w:p>
-      <w:r>
-        <w:br w:type="page"/>
-      </w:r>
-    </w:p>
-    <w:p>
-      <w:pPr>
-        <w:pStyle w:val="Heading1"/>
-      </w:pPr>
-      <w:bookmarkStart w:id="104" w:name="_0cf7f8e9027f9f9352f3019b4ede1d43d537ff7"/>
-      <w:r>
-        <w:t xml:space="preserve">Conclusion</w:t>
-      </w:r>
-      <w:bookmarkEnd w:id="104"/>
-    </w:p>
-    <w:p>
-      <w:pPr>
-        <w:pStyle w:val="FirstParagraph"/>
-      </w:pPr>
-      <w:r>
-        <w:t xml:space="preserve">This study demonstrated a complete computational research pipeline from algorithmic implementation through uncompromising testing, automated analysis, and zero-intervention manuscript generation. Ultimately, it validates the proposition that high-quality mathematical research software benefits from production-tier engineering practices.</w:t>
-      </w:r>
-    </w:p>
-    <w:p>
-      <w:pPr>
-        <w:pStyle w:val="Heading2"/>
-      </w:pPr>
-      <w:bookmarkStart w:id="105" w:name="_b1ac82cf59849a44edffc3601842544aa7feb2e"/>
-      <w:r>
-        <w:t xml:space="preserve">Exemplar Project Achievements</w:t>
-      </w:r>
-      <w:bookmarkEnd w:id="105"/>
-    </w:p>
-    <w:p>
-      <w:pPr>
-        <w:pStyle w:val="FirstParagraph"/>
-      </w:pPr>
-      <w:r>
-        <w:t xml:space="preserve">Operating as the representative exemplar for the Generalized Research Template methodology, the project successfully deployed the three foundational pillars:</w:t>
       </w:r>
     </w:p>
     <w:p>
@@ -12493,28 +12300,52 @@
       </w:pPr>
       <w:r>
         <w:rPr>
-          <w:rStyle w:val="VerbatimChar"/>
           <w:b/>
           <w:bCs/>
         </w:rPr>
-        <w:t xml:space="preserve">infrastructure</w:t>
-      </w:r>
-      <w:r>
-        <w:rPr>
-          <w:b/>
-          <w:bCs/>
-        </w:rPr>
-        <w:t xml:space="preserve"> </w:t>
-      </w:r>
-      <w:r>
-        <w:rPr>
-          <w:b/>
-          <w:bCs/>
-        </w:rPr>
-        <w:t xml:space="preserve">Ecosystem</w:t>
-      </w:r>
-      <w:r>
-        <w:t xml:space="preserve">: Fully leveraged the measured infrastructure package cluster to handle scientific benchmarking, rendering, prose review, literature search, BibTeX validation, and reporting.</w:t>
+        <w:t xml:space="preserve">Infrastructure tests</w:t>
+      </w:r>
+      <w:r>
+        <w:t xml:space="preserve"> </w:t>
+      </w:r>
+      <w:r>
+        <w:t xml:space="preserve">covering all underlying mechanisms across</w:t>
+      </w:r>
+      <w:r>
+        <w:t xml:space="preserve"> </w:t>
+      </w:r>
+      <w:r>
+        <w:rPr>
+          <w:rStyle w:val="VerbatimChar"/>
+        </w:rPr>
+        <w:t xml:space="preserve">infrastructure.reporting</w:t>
+      </w:r>
+      <w:r>
+        <w:t xml:space="preserve">,</w:t>
+      </w:r>
+      <w:r>
+        <w:t xml:space="preserve"> </w:t>
+      </w:r>
+      <w:r>
+        <w:rPr>
+          <w:rStyle w:val="VerbatimChar"/>
+        </w:rPr>
+        <w:t xml:space="preserve">infrastructure.validation</w:t>
+      </w:r>
+      <w:r>
+        <w:t xml:space="preserve">, and</w:t>
+      </w:r>
+      <w:r>
+        <w:t xml:space="preserve"> </w:t>
+      </w:r>
+      <w:r>
+        <w:rPr>
+          <w:rStyle w:val="VerbatimChar"/>
+        </w:rPr>
+        <w:t xml:space="preserve">infrastructure.rendering</w:t>
+      </w:r>
+      <w:r>
+        <w:t xml:space="preserve">.</w:t>
       </w:r>
     </w:p>
     <w:p>
@@ -12527,90 +12358,173 @@
       </w:pPr>
       <w:r>
         <w:rPr>
-          <w:rStyle w:val="VerbatimChar"/>
           <w:b/>
           <w:bCs/>
         </w:rPr>
-        <w:t xml:space="preserve">tests</w:t>
-      </w:r>
-      <w:r>
-        <w:rPr>
-          <w:b/>
-          <w:bCs/>
-        </w:rPr>
-        <w:t xml:space="preserve"> </w:t>
-      </w:r>
-      <w:r>
-        <w:rPr>
-          <w:b/>
-          <w:bCs/>
-        </w:rPr>
-        <w:t xml:space="preserve">Integrity</w:t>
-      </w:r>
-      <w:r>
-        <w:t xml:space="preserve">: Established absolute logical hermeticity through a comprehensive integration and infrastructure validation suite operating continuously.</w:t>
-      </w:r>
-    </w:p>
-    <w:p>
-      <w:pPr>
-        <w:pStyle w:val="Compact"/>
-        <w:numPr>
-          <w:ilvl w:val="0"/>
-          <w:numId w:val="1020"/>
-        </w:numPr>
-      </w:pPr>
-      <w:r>
-        <w:rPr>
-          <w:rStyle w:val="VerbatimChar"/>
-          <w:b/>
-          <w:bCs/>
-        </w:rPr>
-        <w:t xml:space="preserve">docs</w:t>
-      </w:r>
-      <w:r>
-        <w:rPr>
-          <w:b/>
-          <w:bCs/>
-        </w:rPr>
-        <w:t xml:space="preserve"> </w:t>
-      </w:r>
-      <w:r>
-        <w:rPr>
-          <w:b/>
-          <w:bCs/>
-        </w:rPr>
-        <w:t xml:space="preserve">Knowledge Operations</w:t>
-      </w:r>
-      <w:r>
-        <w:t xml:space="preserve">: Adhered structurally to the RASP methodology, producing verified, accessible output spanning from documentation indices to the final LLM-assisted publication configurations.</w:t>
+        <w:t xml:space="preserve">Numerical accuracy</w:t>
+      </w:r>
+      <w:r>
+        <w:t xml:space="preserve"> </w:t>
+      </w:r>
+      <w:r>
+        <w:t xml:space="preserve">checks verified systematically using PyTest.</w:t>
+      </w:r>
+    </w:p>
+    <w:p>
+      <w:pPr>
+        <w:pStyle w:val="FirstParagraph"/>
+      </w:pPr>
+      <w:r>
+        <w:t xml:space="preserve">Passing the declared suite and its 90% coverage floor provides evidence for the tested core logic, convergence detection, and logging pathways. It does not prove correctness for every input or replace scientific validation.</w:t>
       </w:r>
     </w:p>
     <w:p>
       <w:pPr>
         <w:pStyle w:val="Heading2"/>
       </w:pPr>
-      <w:bookmarkStart w:id="106" w:name="_6e8c175903d8fdfc52dfc5aa44bbf84dacbc7d8"/>
-      <w:r>
-        <w:t xml:space="preserve">Technical Contributions</w:t>
-      </w:r>
-      <w:bookmarkEnd w:id="106"/>
-    </w:p>
-    <w:p>
-      <w:pPr>
-        <w:pStyle w:val="Heading3"/>
-      </w:pPr>
-      <w:bookmarkStart w:id="107" w:name="_a7ffebd7cded9137539a0d5590a90e816a99ac0"/>
-      <w:r>
-        <w:t xml:space="preserve">Test Coverage Strategy</w:t>
-      </w:r>
-      <w:bookmarkEnd w:id="107"/>
+      <w:bookmarkStart w:id="103" w:name="_discussion"/>
+      <w:r>
+        <w:t xml:space="preserve">Discussion</w:t>
+      </w:r>
+      <w:bookmarkEnd w:id="103"/>
     </w:p>
     <w:p>
       <w:pPr>
         <w:pStyle w:val="FirstParagraph"/>
       </w:pPr>
       <w:r>
-        <w:t xml:space="preserve">The hallmark of this implementation is the test matrix:</w:t>
+        <w:t xml:space="preserve">The configured results distinguish convergence, iteration-cap termination, and non-finite updates. Iteration counts are not monotonic in step size: the unit-Hessian contraction factor</w:t>
+      </w:r>
+      <w:r>
+        <w:t xml:space="preserve"> </w:t>
+      </w:r>
+      <m:oMath>
+        <m:r>
+          <m:t>ρ</m:t>
+        </m:r>
+        <m:r>
+          <m:rPr>
+            <m:sty m:val="p"/>
+          </m:rPr>
+          <m:t>(</m:t>
+        </m:r>
+        <m:r>
+          <m:t>α</m:t>
+        </m:r>
+        <m:r>
+          <m:rPr>
+            <m:sty m:val="p"/>
+          </m:rPr>
+          <m:t>)</m:t>
+        </m:r>
+        <m:r>
+          <m:rPr>
+            <m:sty m:val="p"/>
+          </m:rPr>
+          <m:t>=</m:t>
+        </m:r>
+        <m:r>
+          <m:rPr>
+            <m:sty m:val="p"/>
+          </m:rPr>
+          <m:t>|</m:t>
+        </m:r>
+        <m:r>
+          <m:t>1</m:t>
+        </m:r>
+        <m:r>
+          <m:rPr>
+            <m:sty m:val="p"/>
+          </m:rPr>
+          <m:t>−</m:t>
+        </m:r>
+        <m:r>
+          <m:t>α</m:t>
+        </m:r>
+        <m:r>
+          <m:rPr>
+            <m:sty m:val="p"/>
+          </m:rPr>
+          <m:t>|</m:t>
+        </m:r>
+      </m:oMath>
+      <w:r>
+        <w:t xml:space="preserve"> </w:t>
+      </w:r>
+      <w:r>
+        <w:t xml:space="preserve">decreases toward</w:t>
+      </w:r>
+      <w:r>
+        <w:t xml:space="preserve"> </w:t>
+      </w:r>
+      <m:oMath>
+        <m:r>
+          <m:t>α</m:t>
+        </m:r>
+        <m:r>
+          <m:rPr>
+            <m:sty m:val="p"/>
+          </m:rPr>
+          <m:t>=</m:t>
+        </m:r>
+        <m:r>
+          <m:t>1</m:t>
+        </m:r>
+      </m:oMath>
+      <w:r>
+        <w:t xml:space="preserve"> </w:t>
+      </w:r>
+      <w:r>
+        <w:t xml:space="preserve">and increases afterward. Accuracy claims apply to converged rows; capped and unstable runs must retain their termination status. The generated table and figures document this finite sweep, not all possible objectives or parameter choices. The analysis pipeline integrates those results into manuscript outputs through the declared configuration and variable injection.</w:t>
+      </w:r>
+    </w:p>
+    <w:p>
+      <w:pPr>
+        <w:pStyle w:val="BodyText"/>
+      </w:pPr>
+      <w:r>
+        <w:t xml:space="preserve">Successful generation and reference resolution establish this artifact path for the tested candidate; they do not establish absolute renderer reliability or replace visual inspection of its output.</w:t>
+      </w:r>
+    </w:p>
+    <w:p>
+      <w:r>
+        <w:br w:type="page"/>
+      </w:r>
+    </w:p>
+    <w:p>
+      <w:pPr>
+        <w:pStyle w:val="Heading1"/>
+      </w:pPr>
+      <w:bookmarkStart w:id="104" w:name="_0cf7f8e9027f9f9352f3019b4ede1d43d537ff7"/>
+      <w:r>
+        <w:t xml:space="preserve">Conclusion</w:t>
+      </w:r>
+      <w:bookmarkEnd w:id="104"/>
+    </w:p>
+    <w:p>
+      <w:pPr>
+        <w:pStyle w:val="FirstParagraph"/>
+      </w:pPr>
+      <w:r>
+        <w:t xml:space="preserve">This study demonstrated a complete computational research pipeline from algorithmic implementation through uncompromising testing, automated analysis, and zero-intervention manuscript generation. Ultimately, it validates the proposition that high-quality mathematical research software benefits from production-tier engineering practices.</w:t>
+      </w:r>
+    </w:p>
+    <w:p>
+      <w:pPr>
+        <w:pStyle w:val="Heading2"/>
+      </w:pPr>
+      <w:bookmarkStart w:id="105" w:name="_b1ac82cf59849a44edffc3601842544aa7feb2e"/>
+      <w:r>
+        <w:t xml:space="preserve">Exemplar Project Achievements</w:t>
+      </w:r>
+      <w:bookmarkEnd w:id="105"/>
+    </w:p>
+    <w:p>
+      <w:pPr>
+        <w:pStyle w:val="FirstParagraph"/>
+      </w:pPr>
+      <w:r>
+        <w:t xml:space="preserve">Operating as the representative exemplar for the Generalized Research Template methodology, the project successfully deployed the three foundational pillars:</w:t>
       </w:r>
     </w:p>
     <w:p>
@@ -12622,7 +12536,29 @@
         </w:numPr>
       </w:pPr>
       <w:r>
-        <w:t xml:space="preserve">Comprehensive tests traversing execution pipelines, integration flows, and algorithmic bounds.</w:t>
+        <w:rPr>
+          <w:rStyle w:val="VerbatimChar"/>
+          <w:b/>
+          <w:bCs/>
+        </w:rPr>
+        <w:t xml:space="preserve">infrastructure</w:t>
+      </w:r>
+      <w:r>
+        <w:rPr>
+          <w:b/>
+          <w:bCs/>
+        </w:rPr>
+        <w:t xml:space="preserve"> </w:t>
+      </w:r>
+      <w:r>
+        <w:rPr>
+          <w:b/>
+          <w:bCs/>
+        </w:rPr>
+        <w:t xml:space="preserve">Ecosystem</w:t>
+      </w:r>
+      <w:r>
+        <w:t xml:space="preserve">: Fully leveraged the measured infrastructure package cluster to handle scientific benchmarking, rendering, prose review, literature search, BibTeX validation, and reporting.</w:t>
       </w:r>
     </w:p>
     <w:p>
@@ -12634,7 +12570,29 @@
         </w:numPr>
       </w:pPr>
       <w:r>
-        <w:t xml:space="preserve">Strict enforcement of zero-mock policies guaranteeing real execution dynamics.</w:t>
+        <w:rPr>
+          <w:rStyle w:val="VerbatimChar"/>
+          <w:b/>
+          <w:bCs/>
+        </w:rPr>
+        <w:t xml:space="preserve">tests</w:t>
+      </w:r>
+      <w:r>
+        <w:rPr>
+          <w:b/>
+          <w:bCs/>
+        </w:rPr>
+        <w:t xml:space="preserve"> </w:t>
+      </w:r>
+      <w:r>
+        <w:rPr>
+          <w:b/>
+          <w:bCs/>
+        </w:rPr>
+        <w:t xml:space="preserve">Integrity</w:t>
+      </w:r>
+      <w:r>
+        <w:t xml:space="preserve">: Established absolute logical hermeticity through a comprehensive integration and infrastructure validation suite operating continuously.</w:t>
       </w:r>
     </w:p>
     <w:p>
@@ -12646,18 +12604,58 @@
         </w:numPr>
       </w:pPr>
       <w:r>
-        <w:t xml:space="preserve">CI/CD validation gates requiring ≥90% statement coverage before progression.</w:t>
-      </w:r>
+        <w:rPr>
+          <w:rStyle w:val="VerbatimChar"/>
+          <w:b/>
+          <w:bCs/>
+        </w:rPr>
+        <w:t xml:space="preserve">docs</w:t>
+      </w:r>
+      <w:r>
+        <w:rPr>
+          <w:b/>
+          <w:bCs/>
+        </w:rPr>
+        <w:t xml:space="preserve"> </w:t>
+      </w:r>
+      <w:r>
+        <w:rPr>
+          <w:b/>
+          <w:bCs/>
+        </w:rPr>
+        <w:t xml:space="preserve">Knowledge Operations</w:t>
+      </w:r>
+      <w:r>
+        <w:t xml:space="preserve">: Adhered structurally to the RASP methodology, producing verified, accessible output spanning from documentation indices to the final LLM-assisted publication configurations.</w:t>
+      </w:r>
+    </w:p>
+    <w:p>
+      <w:pPr>
+        <w:pStyle w:val="Heading2"/>
+      </w:pPr>
+      <w:bookmarkStart w:id="106" w:name="_6e8c175903d8fdfc52dfc5aa44bbf84dacbc7d8"/>
+      <w:r>
+        <w:t xml:space="preserve">Technical Contributions</w:t>
+      </w:r>
+      <w:bookmarkEnd w:id="106"/>
     </w:p>
     <w:p>
       <w:pPr>
         <w:pStyle w:val="Heading3"/>
       </w:pPr>
-      <w:bookmarkStart w:id="108" w:name="_be3792b637ffab5a42ace99b1a582939cfda35a"/>
-      <w:r>
-        <w:t xml:space="preserve">Infrastructure-Backed Capabilities</w:t>
-      </w:r>
-      <w:bookmarkEnd w:id="108"/>
+      <w:bookmarkStart w:id="107" w:name="_a7ffebd7cded9137539a0d5590a90e816a99ac0"/>
+      <w:r>
+        <w:t xml:space="preserve">Test Coverage Strategy</w:t>
+      </w:r>
+      <w:bookmarkEnd w:id="107"/>
+    </w:p>
+    <w:p>
+      <w:pPr>
+        <w:pStyle w:val="FirstParagraph"/>
+      </w:pPr>
+      <w:r>
+        <w:t xml:space="preserve">The hallmark of this implementation is the test matrix:</w:t>
+      </w:r>
     </w:p>
     <w:p>
       <w:pPr>
@@ -12668,50 +12666,7 @@
         </w:numPr>
       </w:pPr>
       <w:r>
-        <w:rPr>
-          <w:b/>
-          <w:bCs/>
-        </w:rPr>
-        <w:t xml:space="preserve">Analytical Automation</w:t>
-      </w:r>
-      <w:r>
-        <w:t xml:space="preserve">:</w:t>
-      </w:r>
-      <w:r>
-        <w:t xml:space="preserve"> </w:t>
-      </w:r>
-      <w:r>
-        <w:rPr>
-          <w:rStyle w:val="VerbatimChar"/>
-        </w:rPr>
-        <w:t xml:space="preserve">infrastructure.core.progress</w:t>
-      </w:r>
-      <w:r>
-        <w:t xml:space="preserve"> </w:t>
-      </w:r>
-      <w:r>
-        <w:t xml:space="preserve">(</w:t>
-      </w:r>
-      <w:r>
-        <w:rPr>
-          <w:rStyle w:val="VerbatimChar"/>
-        </w:rPr>
-        <w:t xml:space="preserve">ProgressBar</w:t>
-      </w:r>
-      <w:r>
-        <w:t xml:space="preserve">,</w:t>
-      </w:r>
-      <w:r>
-        <w:t xml:space="preserve"> </w:t>
-      </w:r>
-      <w:r>
-        <w:rPr>
-          <w:rStyle w:val="VerbatimChar"/>
-        </w:rPr>
-        <w:t xml:space="preserve">SubStageProgress</w:t>
-      </w:r>
-      <w:r>
-        <w:t xml:space="preserve">) executing deterministic optimization experiments.</w:t>
+        <w:t xml:space="preserve">Comprehensive tests traversing execution pipelines, integration flows, and algorithmic bounds.</w:t>
       </w:r>
     </w:p>
     <w:p>
@@ -12723,44 +12678,7 @@
         </w:numPr>
       </w:pPr>
       <w:r>
-        <w:rPr>
-          <w:b/>
-          <w:bCs/>
-        </w:rPr>
-        <w:t xml:space="preserve">Reporting &amp; Integrity</w:t>
-      </w:r>
-      <w:r>
-        <w:t xml:space="preserve">: the supported</w:t>
-      </w:r>
-      <w:r>
-        <w:t xml:space="preserve"> </w:t>
-      </w:r>
-      <w:r>
-        <w:rPr>
-          <w:rStyle w:val="VerbatimChar"/>
-        </w:rPr>
-        <w:t xml:space="preserve">infrastructure.reporting</w:t>
-      </w:r>
-      <w:r>
-        <w:t xml:space="preserve"> </w:t>
-      </w:r>
-      <w:r>
-        <w:t xml:space="preserve">summary API and</w:t>
-      </w:r>
-      <w:r>
-        <w:t xml:space="preserve"> </w:t>
-      </w:r>
-      <w:r>
-        <w:rPr>
-          <w:rStyle w:val="VerbatimChar"/>
-        </w:rPr>
-        <w:t xml:space="preserve">infrastructure.validation.output.validator</w:t>
-      </w:r>
-      <w:r>
-        <w:t xml:space="preserve"> </w:t>
-      </w:r>
-      <w:r>
-        <w:t xml:space="preserve">for output diagnostics.</w:t>
+        <w:t xml:space="preserve">Strict enforcement of zero-mock policies guaranteeing real execution dynamics.</w:t>
       </w:r>
     </w:p>
     <w:p>
@@ -12772,72 +12690,18 @@
         </w:numPr>
       </w:pPr>
       <w:r>
-        <w:rPr>
-          <w:b/>
-          <w:bCs/>
-        </w:rPr>
-        <w:t xml:space="preserve">Visual Cryptography</w:t>
-      </w:r>
-      <w:r>
-        <w:t xml:space="preserve">: Publication-ready graphics compiled by</w:t>
-      </w:r>
-      <w:r>
-        <w:t xml:space="preserve"> </w:t>
-      </w:r>
-      <w:r>
-        <w:rPr>
-          <w:rStyle w:val="VerbatimChar"/>
-        </w:rPr>
-        <w:t xml:space="preserve">infrastructure.rendering.pdf_renderer.py</w:t>
-      </w:r>
-      <w:r>
-        <w:t xml:space="preserve"> </w:t>
-      </w:r>
-      <w:r>
-        <w:t xml:space="preserve">using metadata from</w:t>
-      </w:r>
-      <w:r>
-        <w:t xml:space="preserve"> </w:t>
-      </w:r>
-      <w:r>
-        <w:rPr>
-          <w:rStyle w:val="VerbatimChar"/>
-        </w:rPr>
-        <w:t xml:space="preserve">projects/templates/template_code_project/manuscript/config.yaml</w:t>
-      </w:r>
-      <w:r>
-        <w:t xml:space="preserve">, automatically linked via the LaTeX configuration in</w:t>
-      </w:r>
-      <w:r>
-        <w:t xml:space="preserve"> </w:t>
-      </w:r>
-      <w:r>
-        <w:rPr>
-          <w:rStyle w:val="VerbatimChar"/>
-        </w:rPr>
-        <w:t xml:space="preserve">projects/templates/template_code_project/manuscript/preamble.md</w:t>
-      </w:r>
-      <w:r>
-        <w:t xml:space="preserve">.</w:t>
-      </w:r>
-    </w:p>
-    <w:p>
-      <w:pPr>
-        <w:pStyle w:val="Heading2"/>
-      </w:pPr>
-      <w:bookmarkStart w:id="109" w:name="_23afeb4a205ab50f569ea64373dec2371b0a396"/>
-      <w:r>
-        <w:t xml:space="preserve">Research Pipeline Validation</w:t>
-      </w:r>
-      <w:bookmarkEnd w:id="109"/>
-    </w:p>
-    <w:p>
-      <w:pPr>
-        <w:pStyle w:val="FirstParagraph"/>
-      </w:pPr>
-      <w:r>
-        <w:t xml:space="preserve">The project validates the research template’s ability to handle operations seamlessly across disciplines:</w:t>
-      </w:r>
+        <w:t xml:space="preserve">CI/CD validation gates requiring ≥90% statement coverage before progression.</w:t>
+      </w:r>
+    </w:p>
+    <w:p>
+      <w:pPr>
+        <w:pStyle w:val="Heading3"/>
+      </w:pPr>
+      <w:bookmarkStart w:id="108" w:name="_be3792b637ffab5a42ace99b1a582939cfda35a"/>
+      <w:r>
+        <w:t xml:space="preserve">Infrastructure-Backed Capabilities</w:t>
+      </w:r>
+      <w:bookmarkEnd w:id="108"/>
     </w:p>
     <w:p>
       <w:pPr>
@@ -12852,10 +12716,46 @@
           <w:b/>
           <w:bCs/>
         </w:rPr>
-        <w:t xml:space="preserve">Mathematical fidelity</w:t>
-      </w:r>
-      <w:r>
-        <w:t xml:space="preserve">: Zero-mock gradients and bounds checks solving problems dynamically.</w:t>
+        <w:t xml:space="preserve">Analytical Automation</w:t>
+      </w:r>
+      <w:r>
+        <w:t xml:space="preserve">:</w:t>
+      </w:r>
+      <w:r>
+        <w:t xml:space="preserve"> </w:t>
+      </w:r>
+      <w:r>
+        <w:rPr>
+          <w:rStyle w:val="VerbatimChar"/>
+        </w:rPr>
+        <w:t xml:space="preserve">infrastructure.core.progress</w:t>
+      </w:r>
+      <w:r>
+        <w:t xml:space="preserve"> </w:t>
+      </w:r>
+      <w:r>
+        <w:t xml:space="preserve">(</w:t>
+      </w:r>
+      <w:r>
+        <w:rPr>
+          <w:rStyle w:val="VerbatimChar"/>
+        </w:rPr>
+        <w:t xml:space="preserve">ProgressBar</w:t>
+      </w:r>
+      <w:r>
+        <w:t xml:space="preserve">,</w:t>
+      </w:r>
+      <w:r>
+        <w:t xml:space="preserve"> </w:t>
+      </w:r>
+      <w:r>
+        <w:rPr>
+          <w:rStyle w:val="VerbatimChar"/>
+        </w:rPr>
+        <w:t xml:space="preserve">SubStageProgress</w:t>
+      </w:r>
+      <w:r>
+        <w:t xml:space="preserve">) executing deterministic optimization experiments.</w:t>
       </w:r>
     </w:p>
     <w:p>
@@ -12871,10 +12771,40 @@
           <w:b/>
           <w:bCs/>
         </w:rPr>
-        <w:t xml:space="preserve">Reporting architecture</w:t>
-      </w:r>
-      <w:r>
-        <w:t xml:space="preserve">: Cross-project and local metrics compiled rapidly into dashboards.</w:t>
+        <w:t xml:space="preserve">Reporting &amp; Integrity</w:t>
+      </w:r>
+      <w:r>
+        <w:t xml:space="preserve">: the supported</w:t>
+      </w:r>
+      <w:r>
+        <w:t xml:space="preserve"> </w:t>
+      </w:r>
+      <w:r>
+        <w:rPr>
+          <w:rStyle w:val="VerbatimChar"/>
+        </w:rPr>
+        <w:t xml:space="preserve">infrastructure.reporting</w:t>
+      </w:r>
+      <w:r>
+        <w:t xml:space="preserve"> </w:t>
+      </w:r>
+      <w:r>
+        <w:t xml:space="preserve">summary API and</w:t>
+      </w:r>
+      <w:r>
+        <w:t xml:space="preserve"> </w:t>
+      </w:r>
+      <w:r>
+        <w:rPr>
+          <w:rStyle w:val="VerbatimChar"/>
+        </w:rPr>
+        <w:t xml:space="preserve">infrastructure.validation.output.validator</w:t>
+      </w:r>
+      <w:r>
+        <w:t xml:space="preserve"> </w:t>
+      </w:r>
+      <w:r>
+        <w:t xml:space="preserve">for output diagnostics.</w:t>
       </w:r>
     </w:p>
     <w:p>
@@ -12890,40 +12820,68 @@
           <w:b/>
           <w:bCs/>
         </w:rPr>
-        <w:t xml:space="preserve">Multi-format scaling</w:t>
-      </w:r>
-      <w:r>
-        <w:t xml:space="preserve">: Effortless conversion from semantic Markdown files to LaTeX-structured PDFs.</w:t>
-      </w:r>
-    </w:p>
-    <w:p>
-      <w:pPr>
-        <w:pStyle w:val="Compact"/>
-        <w:numPr>
-          <w:ilvl w:val="0"/>
-          <w:numId w:val="1023"/>
-        </w:numPr>
-      </w:pPr>
-      <w:r>
-        <w:rPr>
-          <w:b/>
-          <w:bCs/>
-        </w:rPr>
-        <w:t xml:space="preserve">Intelligent Verification</w:t>
-      </w:r>
-      <w:r>
-        <w:t xml:space="preserve">: LLM integration analyzing output completeness contextually without degrading hermetic logic.</w:t>
+        <w:t xml:space="preserve">Visual Cryptography</w:t>
+      </w:r>
+      <w:r>
+        <w:t xml:space="preserve">: Publication-ready graphics compiled by</w:t>
+      </w:r>
+      <w:r>
+        <w:t xml:space="preserve"> </w:t>
+      </w:r>
+      <w:r>
+        <w:rPr>
+          <w:rStyle w:val="VerbatimChar"/>
+        </w:rPr>
+        <w:t xml:space="preserve">infrastructure.rendering.pdf_renderer.py</w:t>
+      </w:r>
+      <w:r>
+        <w:t xml:space="preserve"> </w:t>
+      </w:r>
+      <w:r>
+        <w:t xml:space="preserve">using metadata from</w:t>
+      </w:r>
+      <w:r>
+        <w:t xml:space="preserve"> </w:t>
+      </w:r>
+      <w:r>
+        <w:rPr>
+          <w:rStyle w:val="VerbatimChar"/>
+        </w:rPr>
+        <w:t xml:space="preserve">projects/templates/template_code_project/manuscript/config.yaml</w:t>
+      </w:r>
+      <w:r>
+        <w:t xml:space="preserve">, automatically linked via the LaTeX configuration in</w:t>
+      </w:r>
+      <w:r>
+        <w:t xml:space="preserve"> </w:t>
+      </w:r>
+      <w:r>
+        <w:rPr>
+          <w:rStyle w:val="VerbatimChar"/>
+        </w:rPr>
+        <w:t xml:space="preserve">projects/templates/template_code_project/manuscript/preamble.md</w:t>
+      </w:r>
+      <w:r>
+        <w:t xml:space="preserve">.</w:t>
       </w:r>
     </w:p>
     <w:p>
       <w:pPr>
         <w:pStyle w:val="Heading2"/>
       </w:pPr>
-      <w:bookmarkStart w:id="110" w:name="_38c68401c6a868408df8f6e93ee0261d7396797"/>
-      <w:r>
-        <w:t xml:space="preserve">Key Insights</w:t>
-      </w:r>
-      <w:bookmarkEnd w:id="110"/>
+      <w:bookmarkStart w:id="109" w:name="_23afeb4a205ab50f569ea64373dec2371b0a396"/>
+      <w:r>
+        <w:t xml:space="preserve">Research Pipeline Validation</w:t>
+      </w:r>
+      <w:bookmarkEnd w:id="109"/>
+    </w:p>
+    <w:p>
+      <w:pPr>
+        <w:pStyle w:val="FirstParagraph"/>
+      </w:pPr>
+      <w:r>
+        <w:t xml:space="preserve">The project validates the research template’s ability to handle operations seamlessly across disciplines:</w:t>
+      </w:r>
     </w:p>
     <w:p>
       <w:pPr>
@@ -12938,10 +12896,10 @@
           <w:b/>
           <w:bCs/>
         </w:rPr>
-        <w:t xml:space="preserve">Mathematical Accuracy Requires Testing Fidelity</w:t>
-      </w:r>
-      <w:r>
-        <w:t xml:space="preserve">: Real execution data, unpolluted by mocks, exposes actual computational limits fast.</w:t>
+        <w:t xml:space="preserve">Mathematical fidelity</w:t>
+      </w:r>
+      <w:r>
+        <w:t xml:space="preserve">: Zero-mock gradients and bounds checks solving problems dynamically.</w:t>
       </w:r>
     </w:p>
     <w:p>
@@ -12957,34 +12915,10 @@
           <w:b/>
           <w:bCs/>
         </w:rPr>
-        <w:t xml:space="preserve">Infrastructure Abstraction</w:t>
-      </w:r>
-      <w:r>
-        <w:t xml:space="preserve">: By delegating tracking to the underlying</w:t>
-      </w:r>
-      <w:r>
-        <w:t xml:space="preserve"> </w:t>
-      </w:r>
-      <w:r>
-        <w:rPr>
-          <w:rStyle w:val="VerbatimChar"/>
-        </w:rPr>
-        <w:t xml:space="preserve">infrastructure</w:t>
-      </w:r>
-      <w:r>
-        <w:t xml:space="preserve">, scientists remain hyper-focused on their</w:t>
-      </w:r>
-      <w:r>
-        <w:t xml:space="preserve"> </w:t>
-      </w:r>
-      <w:r>
-        <w:rPr>
-          <w:rStyle w:val="VerbatimChar"/>
-        </w:rPr>
-        <w:t xml:space="preserve">algorithm</w:t>
-      </w:r>
-      <w:r>
-        <w:t xml:space="preserve">.</w:t>
+        <w:t xml:space="preserve">Reporting architecture</w:t>
+      </w:r>
+      <w:r>
+        <w:t xml:space="preserve">: Cross-project and local metrics compiled rapidly into dashboards.</w:t>
       </w:r>
     </w:p>
     <w:p>
@@ -13000,29 +12934,40 @@
           <w:b/>
           <w:bCs/>
         </w:rPr>
-        <w:t xml:space="preserve">Automated Consistency</w:t>
-      </w:r>
-      <w:r>
-        <w:t xml:space="preserve">: Re-compiling the pipeline enforces an immutable bond between algorithm version and final visual reporting.</w:t>
+        <w:t xml:space="preserve">Multi-format scaling</w:t>
+      </w:r>
+      <w:r>
+        <w:t xml:space="preserve">: Effortless conversion from semantic Markdown files to LaTeX-structured PDFs.</w:t>
+      </w:r>
+    </w:p>
+    <w:p>
+      <w:pPr>
+        <w:pStyle w:val="Compact"/>
+        <w:numPr>
+          <w:ilvl w:val="0"/>
+          <w:numId w:val="1024"/>
+        </w:numPr>
+      </w:pPr>
+      <w:r>
+        <w:rPr>
+          <w:b/>
+          <w:bCs/>
+        </w:rPr>
+        <w:t xml:space="preserve">Intelligent Verification</w:t>
+      </w:r>
+      <w:r>
+        <w:t xml:space="preserve">: LLM integration analyzing output completeness contextually without degrading hermetic logic.</w:t>
       </w:r>
     </w:p>
     <w:p>
       <w:pPr>
         <w:pStyle w:val="Heading2"/>
       </w:pPr>
-      <w:bookmarkStart w:id="111" w:name="_24ca540b4ce4a452b002ede7c66af228647cf58"/>
-      <w:r>
-        <w:t xml:space="preserve">Future Extensions</w:t>
-      </w:r>
-      <w:bookmarkEnd w:id="111"/>
-    </w:p>
-    <w:p>
-      <w:pPr>
-        <w:pStyle w:val="FirstParagraph"/>
-      </w:pPr>
-      <w:r>
-        <w:t xml:space="preserve">This foundation could be extended to:</w:t>
-      </w:r>
+      <w:bookmarkStart w:id="110" w:name="_38c68401c6a868408df8f6e93ee0261d7396797"/>
+      <w:r>
+        <w:t xml:space="preserve">Key Insights</w:t>
+      </w:r>
+      <w:bookmarkEnd w:id="110"/>
     </w:p>
     <w:p>
       <w:pPr>
@@ -13037,10 +12982,10 @@
           <w:b/>
           <w:bCs/>
         </w:rPr>
-        <w:t xml:space="preserve">Advanced algorithms</w:t>
-      </w:r>
-      <w:r>
-        <w:t xml:space="preserve">: Newton methods, quasi-Newton approaches</w:t>
+        <w:t xml:space="preserve">Mathematical Accuracy Requires Testing Fidelity</w:t>
+      </w:r>
+      <w:r>
+        <w:t xml:space="preserve">: Real execution data, unpolluted by mocks, exposes actual computational limits fast.</w:t>
       </w:r>
     </w:p>
     <w:p>
@@ -13056,10 +13001,34 @@
           <w:b/>
           <w:bCs/>
         </w:rPr>
-        <w:t xml:space="preserve">Constrained optimization</w:t>
-      </w:r>
-      <w:r>
-        <w:t xml:space="preserve">: Handling inequality constraints</w:t>
+        <w:t xml:space="preserve">Infrastructure Abstraction</w:t>
+      </w:r>
+      <w:r>
+        <w:t xml:space="preserve">: By delegating tracking to the underlying</w:t>
+      </w:r>
+      <w:r>
+        <w:t xml:space="preserve"> </w:t>
+      </w:r>
+      <w:r>
+        <w:rPr>
+          <w:rStyle w:val="VerbatimChar"/>
+        </w:rPr>
+        <w:t xml:space="preserve">infrastructure</w:t>
+      </w:r>
+      <w:r>
+        <w:t xml:space="preserve">, scientists remain hyper-focused on their</w:t>
+      </w:r>
+      <w:r>
+        <w:t xml:space="preserve"> </w:t>
+      </w:r>
+      <w:r>
+        <w:rPr>
+          <w:rStyle w:val="VerbatimChar"/>
+        </w:rPr>
+        <w:t xml:space="preserve">algorithm</w:t>
+      </w:r>
+      <w:r>
+        <w:t xml:space="preserve">.</w:t>
       </w:r>
     </w:p>
     <w:p>
@@ -13075,16 +13044,28 @@
           <w:b/>
           <w:bCs/>
         </w:rPr>
-        <w:t xml:space="preserve">Stochastic methods</w:t>
-      </w:r>
-      <w:r>
-        <w:t xml:space="preserve">: Mini-batch and online learning variants, including adaptive optimization algorithms such as Adam</w:t>
-      </w:r>
-      <w:r>
-        <w:t xml:space="preserve"> </w:t>
-      </w:r>
-      <w:r>
-        <w:t xml:space="preserve">(Kingma and Ba 2015)</w:t>
+        <w:t xml:space="preserve">Automated Consistency</w:t>
+      </w:r>
+      <w:r>
+        <w:t xml:space="preserve">: Re-compiling the pipeline enforces an immutable bond between algorithm version and final visual reporting.</w:t>
+      </w:r>
+    </w:p>
+    <w:p>
+      <w:pPr>
+        <w:pStyle w:val="Heading2"/>
+      </w:pPr>
+      <w:bookmarkStart w:id="111" w:name="_24ca540b4ce4a452b002ede7c66af228647cf58"/>
+      <w:r>
+        <w:t xml:space="preserve">Future Extensions</w:t>
+      </w:r>
+      <w:bookmarkEnd w:id="111"/>
+    </w:p>
+    <w:p>
+      <w:pPr>
+        <w:pStyle w:val="FirstParagraph"/>
+      </w:pPr>
+      <w:r>
+        <w:t xml:space="preserve">This foundation could be extended to:</w:t>
       </w:r>
     </w:p>
     <w:p>
@@ -13092,7 +13073,70 @@
         <w:pStyle w:val="Compact"/>
         <w:numPr>
           <w:ilvl w:val="0"/>
-          <w:numId w:val="1025"/>
+          <w:numId w:val="1026"/>
+        </w:numPr>
+      </w:pPr>
+      <w:r>
+        <w:rPr>
+          <w:b/>
+          <w:bCs/>
+        </w:rPr>
+        <w:t xml:space="preserve">Advanced algorithms</w:t>
+      </w:r>
+      <w:r>
+        <w:t xml:space="preserve">: Newton methods, quasi-Newton approaches</w:t>
+      </w:r>
+    </w:p>
+    <w:p>
+      <w:pPr>
+        <w:pStyle w:val="Compact"/>
+        <w:numPr>
+          <w:ilvl w:val="0"/>
+          <w:numId w:val="1026"/>
+        </w:numPr>
+      </w:pPr>
+      <w:r>
+        <w:rPr>
+          <w:b/>
+          <w:bCs/>
+        </w:rPr>
+        <w:t xml:space="preserve">Constrained optimization</w:t>
+      </w:r>
+      <w:r>
+        <w:t xml:space="preserve">: Handling inequality constraints</w:t>
+      </w:r>
+    </w:p>
+    <w:p>
+      <w:pPr>
+        <w:pStyle w:val="Compact"/>
+        <w:numPr>
+          <w:ilvl w:val="0"/>
+          <w:numId w:val="1026"/>
+        </w:numPr>
+      </w:pPr>
+      <w:r>
+        <w:rPr>
+          <w:b/>
+          <w:bCs/>
+        </w:rPr>
+        <w:t xml:space="preserve">Stochastic methods</w:t>
+      </w:r>
+      <w:r>
+        <w:t xml:space="preserve">: Mini-batch and online learning variants, including adaptive optimization algorithms such as Adam</w:t>
+      </w:r>
+      <w:r>
+        <w:t xml:space="preserve"> </w:t>
+      </w:r>
+      <w:r>
+        <w:t xml:space="preserve">(Kingma and Ba 2015)</w:t>
+      </w:r>
+    </w:p>
+    <w:p>
+      <w:pPr>
+        <w:pStyle w:val="Compact"/>
+        <w:numPr>
+          <w:ilvl w:val="0"/>
+          <w:numId w:val="1026"/>
         </w:numPr>
       </w:pPr>
       <w:r>
@@ -13622,7 +13666,7 @@
         <w:pStyle w:val="Compact"/>
         <w:numPr>
           <w:ilvl w:val="0"/>
-          <w:numId w:val="1026"/>
+          <w:numId w:val="1027"/>
         </w:numPr>
       </w:pPr>
       <m:oMath>
@@ -13651,7 +13695,7 @@
         <w:pStyle w:val="Compact"/>
         <w:numPr>
           <w:ilvl w:val="0"/>
-          <w:numId w:val="1026"/>
+          <w:numId w:val="1027"/>
         </w:numPr>
       </w:pPr>
       <m:oMath>
@@ -13680,7 +13724,7 @@
         <w:pStyle w:val="Compact"/>
         <w:numPr>
           <w:ilvl w:val="0"/>
-          <w:numId w:val="1026"/>
+          <w:numId w:val="1027"/>
         </w:numPr>
       </w:pPr>
       <m:oMath>
@@ -13709,7 +13753,7 @@
         <w:pStyle w:val="Compact"/>
         <w:numPr>
           <w:ilvl w:val="0"/>
-          <w:numId w:val="1026"/>
+          <w:numId w:val="1027"/>
         </w:numPr>
       </w:pPr>
       <m:oMath>
@@ -13738,7 +13782,7 @@
         <w:pStyle w:val="Compact"/>
         <w:numPr>
           <w:ilvl w:val="0"/>
-          <w:numId w:val="1026"/>
+          <w:numId w:val="1027"/>
         </w:numPr>
       </w:pPr>
       <m:oMath>
@@ -13767,7 +13811,7 @@
         <w:pStyle w:val="Compact"/>
         <w:numPr>
           <w:ilvl w:val="0"/>
-          <w:numId w:val="1026"/>
+          <w:numId w:val="1027"/>
         </w:numPr>
       </w:pPr>
       <m:oMath>
@@ -14123,7 +14167,7 @@
         <w:pStyle w:val="Compact"/>
         <w:numPr>
           <w:ilvl w:val="0"/>
-          <w:numId w:val="1027"/>
+          <w:numId w:val="1028"/>
         </w:numPr>
       </w:pPr>
       <w:r>
@@ -14135,111 +14179,6 @@
       </w:r>
       <w:r>
         <w:t xml:space="preserve">: 3.14.8</w:t>
-      </w:r>
-    </w:p>
-    <w:p>
-      <w:pPr>
-        <w:pStyle w:val="Compact"/>
-        <w:numPr>
-          <w:ilvl w:val="0"/>
-          <w:numId w:val="1027"/>
-        </w:numPr>
-      </w:pPr>
-      <w:r>
-        <w:rPr>
-          <w:b/>
-          <w:bCs/>
-        </w:rPr>
-        <w:t xml:space="preserve">NumPy</w:t>
-      </w:r>
-      <w:r>
-        <w:t xml:space="preserve">: 2.4.2</w:t>
-      </w:r>
-    </w:p>
-    <w:p>
-      <w:pPr>
-        <w:pStyle w:val="Compact"/>
-        <w:numPr>
-          <w:ilvl w:val="0"/>
-          <w:numId w:val="1027"/>
-        </w:numPr>
-      </w:pPr>
-      <w:r>
-        <w:rPr>
-          <w:b/>
-          <w:bCs/>
-        </w:rPr>
-        <w:t xml:space="preserve">Platform</w:t>
-      </w:r>
-      <w:r>
-        <w:t xml:space="preserve">: Darwin arm64</w:t>
-      </w:r>
-    </w:p>
-    <w:p>
-      <w:pPr>
-        <w:pStyle w:val="Compact"/>
-        <w:numPr>
-          <w:ilvl w:val="0"/>
-          <w:numId w:val="1027"/>
-        </w:numPr>
-      </w:pPr>
-      <w:r>
-        <w:rPr>
-          <w:b/>
-          <w:bCs/>
-        </w:rPr>
-        <w:t xml:space="preserve">Generated</w:t>
-      </w:r>
-      <w:r>
-        <w:t xml:space="preserve">: 2026-10-22T17:22:44Z</w:t>
-      </w:r>
-    </w:p>
-    <w:p>
-      <w:pPr>
-        <w:pStyle w:val="Heading2"/>
-      </w:pPr>
-      <w:bookmarkStart w:id="120" w:name="_c0bdf268a00be518db8208d76da5f861b68d87a"/>
-      <w:r>
-        <w:t xml:space="preserve">Pipeline ordering</w:t>
-      </w:r>
-      <w:bookmarkEnd w:id="120"/>
-    </w:p>
-    <w:p>
-      <w:pPr>
-        <w:pStyle w:val="FirstParagraph"/>
-      </w:pPr>
-      <w:r>
-        <w:t xml:space="preserve">Typical</w:t>
-      </w:r>
-      <w:r>
-        <w:t xml:space="preserve"> </w:t>
-      </w:r>
-      <w:r>
-        <w:rPr>
-          <w:rStyle w:val="VerbatimChar"/>
-        </w:rPr>
-        <w:t xml:space="preserve">template_code_project</w:t>
-      </w:r>
-      <w:r>
-        <w:t xml:space="preserve"> </w:t>
-      </w:r>
-      <w:r>
-        <w:t xml:space="preserve">analysis order (see</w:t>
-      </w:r>
-      <w:r>
-        <w:t xml:space="preserve"> </w:t>
-      </w:r>
-      <w:r>
-        <w:rPr>
-          <w:rStyle w:val="VerbatimChar"/>
-        </w:rPr>
-        <w:t xml:space="preserve">scripts/pipeline/stage_02_analysis.py</w:t>
-      </w:r>
-      <w:r>
-        <w:t xml:space="preserve"> </w:t>
-      </w:r>
-      <w:r>
-        <w:t xml:space="preserve">discovery) is:</w:t>
       </w:r>
     </w:p>
     <w:p>
@@ -14252,51 +14191,13 @@
       </w:pPr>
       <w:r>
         <w:rPr>
-          <w:rStyle w:val="VerbatimChar"/>
-        </w:rPr>
-        <w:t xml:space="preserve">optimization_analysis.py</w:t>
-      </w:r>
-      <w:r>
-        <w:t xml:space="preserve"> </w:t>
-      </w:r>
-      <w:r>
-        <w:t xml:space="preserve">— writes</w:t>
-      </w:r>
-      <w:r>
-        <w:t xml:space="preserve"> </w:t>
-      </w:r>
-      <w:r>
-        <w:rPr>
-          <w:rStyle w:val="VerbatimChar"/>
-        </w:rPr>
-        <w:t xml:space="preserve">output/data/optimization_results.csv</w:t>
-      </w:r>
-      <w:r>
-        <w:t xml:space="preserve">,</w:t>
-      </w:r>
-      <w:r>
-        <w:t xml:space="preserve"> </w:t>
-      </w:r>
-      <w:r>
-        <w:rPr>
-          <w:rStyle w:val="VerbatimChar"/>
-        </w:rPr>
-        <w:t xml:space="preserve">../figures/*.png</w:t>
-      </w:r>
-      <w:r>
-        <w:t xml:space="preserve">, and JSON reports under</w:t>
-      </w:r>
-      <w:r>
-        <w:t xml:space="preserve"> </w:t>
-      </w:r>
-      <w:r>
-        <w:rPr>
-          <w:rStyle w:val="VerbatimChar"/>
-        </w:rPr>
-        <w:t xml:space="preserve">output/reports/</w:t>
-      </w:r>
-      <w:r>
-        <w:t xml:space="preserve">.</w:t>
+          <w:b/>
+          <w:bCs/>
+        </w:rPr>
+        <w:t xml:space="preserve">NumPy</w:t>
+      </w:r>
+      <w:r>
+        <w:t xml:space="preserve">: 2.4.2</w:t>
       </w:r>
     </w:p>
     <w:p>
@@ -14309,42 +14210,13 @@
       </w:pPr>
       <w:r>
         <w:rPr>
-          <w:rStyle w:val="VerbatimChar"/>
-        </w:rPr>
-        <w:t xml:space="preserve">z_generate_manuscript_variables.py</w:t>
-      </w:r>
-      <w:r>
-        <w:t xml:space="preserve"> </w:t>
-      </w:r>
-      <w:r>
-        <w:t xml:space="preserve">— reads the CSV and YAML, emits</w:t>
-      </w:r>
-      <w:r>
-        <w:t xml:space="preserve"> </w:t>
-      </w:r>
-      <w:r>
-        <w:rPr>
-          <w:rStyle w:val="VerbatimChar"/>
-        </w:rPr>
-        <w:t xml:space="preserve">output/data/manuscript_variables.json</w:t>
-      </w:r>
-      <w:r>
-        <w:t xml:space="preserve">, and writes substituted copies to</w:t>
-      </w:r>
-      <w:r>
-        <w:t xml:space="preserve"> </w:t>
-      </w:r>
-      <w:r>
-        <w:rPr>
-          <w:rStyle w:val="VerbatimChar"/>
-        </w:rPr>
-        <w:t xml:space="preserve">output/manuscript/</w:t>
-      </w:r>
-      <w:r>
-        <w:t xml:space="preserve"> </w:t>
-      </w:r>
-      <w:r>
-        <w:t xml:space="preserve">for rendering.</w:t>
+          <w:b/>
+          <w:bCs/>
+        </w:rPr>
+        <w:t xml:space="preserve">Platform</w:t>
+      </w:r>
+      <w:r>
+        <w:t xml:space="preserve">: Darwin arm64</w:t>
       </w:r>
     </w:p>
     <w:p>
@@ -14353,6 +14225,178 @@
         <w:numPr>
           <w:ilvl w:val="0"/>
           <w:numId w:val="1028"/>
+        </w:numPr>
+      </w:pPr>
+      <w:r>
+        <w:rPr>
+          <w:b/>
+          <w:bCs/>
+        </w:rPr>
+        <w:t xml:space="preserve">Generated</w:t>
+      </w:r>
+      <w:r>
+        <w:t xml:space="preserve">: 2026-10-22T20:31:52Z</w:t>
+      </w:r>
+    </w:p>
+    <w:p>
+      <w:pPr>
+        <w:pStyle w:val="Heading2"/>
+      </w:pPr>
+      <w:bookmarkStart w:id="120" w:name="_c0bdf268a00be518db8208d76da5f861b68d87a"/>
+      <w:r>
+        <w:t xml:space="preserve">Pipeline ordering</w:t>
+      </w:r>
+      <w:bookmarkEnd w:id="120"/>
+    </w:p>
+    <w:p>
+      <w:pPr>
+        <w:pStyle w:val="FirstParagraph"/>
+      </w:pPr>
+      <w:r>
+        <w:t xml:space="preserve">Typical</w:t>
+      </w:r>
+      <w:r>
+        <w:t xml:space="preserve"> </w:t>
+      </w:r>
+      <w:r>
+        <w:rPr>
+          <w:rStyle w:val="VerbatimChar"/>
+        </w:rPr>
+        <w:t xml:space="preserve">template_code_project</w:t>
+      </w:r>
+      <w:r>
+        <w:t xml:space="preserve"> </w:t>
+      </w:r>
+      <w:r>
+        <w:t xml:space="preserve">analysis order (see</w:t>
+      </w:r>
+      <w:r>
+        <w:t xml:space="preserve"> </w:t>
+      </w:r>
+      <w:r>
+        <w:rPr>
+          <w:rStyle w:val="VerbatimChar"/>
+        </w:rPr>
+        <w:t xml:space="preserve">scripts/pipeline/stage_02_analysis.py</w:t>
+      </w:r>
+      <w:r>
+        <w:t xml:space="preserve"> </w:t>
+      </w:r>
+      <w:r>
+        <w:t xml:space="preserve">discovery) is:</w:t>
+      </w:r>
+    </w:p>
+    <w:p>
+      <w:pPr>
+        <w:pStyle w:val="Compact"/>
+        <w:numPr>
+          <w:ilvl w:val="0"/>
+          <w:numId w:val="1029"/>
+        </w:numPr>
+      </w:pPr>
+      <w:r>
+        <w:rPr>
+          <w:rStyle w:val="VerbatimChar"/>
+        </w:rPr>
+        <w:t xml:space="preserve">optimization_analysis.py</w:t>
+      </w:r>
+      <w:r>
+        <w:t xml:space="preserve"> </w:t>
+      </w:r>
+      <w:r>
+        <w:t xml:space="preserve">— writes</w:t>
+      </w:r>
+      <w:r>
+        <w:t xml:space="preserve"> </w:t>
+      </w:r>
+      <w:r>
+        <w:rPr>
+          <w:rStyle w:val="VerbatimChar"/>
+        </w:rPr>
+        <w:t xml:space="preserve">output/data/optimization_results.csv</w:t>
+      </w:r>
+      <w:r>
+        <w:t xml:space="preserve">,</w:t>
+      </w:r>
+      <w:r>
+        <w:t xml:space="preserve"> </w:t>
+      </w:r>
+      <w:r>
+        <w:rPr>
+          <w:rStyle w:val="VerbatimChar"/>
+        </w:rPr>
+        <w:t xml:space="preserve">../figures/*.png</w:t>
+      </w:r>
+      <w:r>
+        <w:t xml:space="preserve">, and JSON reports under</w:t>
+      </w:r>
+      <w:r>
+        <w:t xml:space="preserve"> </w:t>
+      </w:r>
+      <w:r>
+        <w:rPr>
+          <w:rStyle w:val="VerbatimChar"/>
+        </w:rPr>
+        <w:t xml:space="preserve">output/reports/</w:t>
+      </w:r>
+      <w:r>
+        <w:t xml:space="preserve">.</w:t>
+      </w:r>
+    </w:p>
+    <w:p>
+      <w:pPr>
+        <w:pStyle w:val="Compact"/>
+        <w:numPr>
+          <w:ilvl w:val="0"/>
+          <w:numId w:val="1029"/>
+        </w:numPr>
+      </w:pPr>
+      <w:r>
+        <w:rPr>
+          <w:rStyle w:val="VerbatimChar"/>
+        </w:rPr>
+        <w:t xml:space="preserve">z_generate_manuscript_variables.py</w:t>
+      </w:r>
+      <w:r>
+        <w:t xml:space="preserve"> </w:t>
+      </w:r>
+      <w:r>
+        <w:t xml:space="preserve">— reads the CSV and YAML, emits</w:t>
+      </w:r>
+      <w:r>
+        <w:t xml:space="preserve"> </w:t>
+      </w:r>
+      <w:r>
+        <w:rPr>
+          <w:rStyle w:val="VerbatimChar"/>
+        </w:rPr>
+        <w:t xml:space="preserve">output/data/manuscript_variables.json</w:t>
+      </w:r>
+      <w:r>
+        <w:t xml:space="preserve">, and writes substituted copies to</w:t>
+      </w:r>
+      <w:r>
+        <w:t xml:space="preserve"> </w:t>
+      </w:r>
+      <w:r>
+        <w:rPr>
+          <w:rStyle w:val="VerbatimChar"/>
+        </w:rPr>
+        <w:t xml:space="preserve">output/manuscript/</w:t>
+      </w:r>
+      <w:r>
+        <w:t xml:space="preserve"> </w:t>
+      </w:r>
+      <w:r>
+        <w:t xml:space="preserve">for rendering.</w:t>
+      </w:r>
+    </w:p>
+    <w:p>
+      <w:pPr>
+        <w:pStyle w:val="Compact"/>
+        <w:numPr>
+          <w:ilvl w:val="0"/>
+          <w:numId w:val="1029"/>
         </w:numPr>
       </w:pPr>
       <w:r>
@@ -15217,329 +15261,11 @@
         <w:pStyle w:val="Compact"/>
         <w:numPr>
           <w:ilvl w:val="0"/>
-          <w:numId w:val="1029"/>
+          <w:numId w:val="1030"/>
         </w:numPr>
       </w:pPr>
       <w:r>
         <w:t xml:space="preserve">Converged step sizes: 0.1, 0.5, 1.0, 1.5</w:t>
-      </w:r>
-    </w:p>
-    <w:p>
-      <w:pPr>
-        <w:pStyle w:val="Compact"/>
-        <w:numPr>
-          <w:ilvl w:val="0"/>
-          <w:numId w:val="1029"/>
-        </w:numPr>
-      </w:pPr>
-      <w:r>
-        <w:t xml:space="preserve">Non-convergent or hit-iteration-cap step sizes: 0.01, 2.5</w:t>
-      </w:r>
-    </w:p>
-    <w:p>
-      <w:pPr>
-        <w:pStyle w:val="Compact"/>
-        <w:numPr>
-          <w:ilvl w:val="0"/>
-          <w:numId w:val="1029"/>
-        </w:numPr>
-      </w:pPr>
-      <w:r>
-        <w:t xml:space="preserve">Smallest recorded iteration count: 1 (at</w:t>
-      </w:r>
-      <w:r>
-        <w:t xml:space="preserve"> </w:t>
-      </w:r>
-      <m:oMath>
-        <m:r>
-          <m:t>α</m:t>
-        </m:r>
-        <m:r>
-          <m:rPr>
-            <m:sty m:val="p"/>
-          </m:rPr>
-          <m:t>=</m:t>
-        </m:r>
-        <m:r>
-          <m:t>1.0</m:t>
-        </m:r>
-      </m:oMath>
-      <w:r>
-        <w:t xml:space="preserve">)</w:t>
-      </w:r>
-    </w:p>
-    <w:p>
-      <w:pPr>
-        <w:pStyle w:val="Compact"/>
-        <w:numPr>
-          <w:ilvl w:val="0"/>
-          <w:numId w:val="1029"/>
-        </w:numPr>
-      </w:pPr>
-      <w:r>
-        <w:t xml:space="preserve">Largest recorded iteration count: 1000 (at</w:t>
-      </w:r>
-      <w:r>
-        <w:t xml:space="preserve"> </w:t>
-      </w:r>
-      <m:oMath>
-        <m:r>
-          <m:t>α</m:t>
-        </m:r>
-        <m:r>
-          <m:rPr>
-            <m:sty m:val="p"/>
-          </m:rPr>
-          <m:t>=</m:t>
-        </m:r>
-        <m:r>
-          <m:t>0.01</m:t>
-        </m:r>
-      </m:oMath>
-      <w:r>
-        <w:t xml:space="preserve">)</w:t>
-      </w:r>
-    </w:p>
-    <w:p>
-      <w:pPr>
-        <w:pStyle w:val="Compact"/>
-        <w:numPr>
-          <w:ilvl w:val="0"/>
-          <w:numId w:val="1029"/>
-        </w:numPr>
-      </w:pPr>
-      <w:r>
-        <w:t xml:space="preserve">Mean iterations across all rows: 351</w:t>
-      </w:r>
-    </w:p>
-    <w:p>
-      <w:pPr>
-        <w:pStyle w:val="Heading3"/>
-      </w:pPr>
-      <w:bookmarkStart w:id="127" w:name="_a2edcaa346316b0bdc1134fa14e0ff53f35209c"/>
-      <w:r>
-        <w:t xml:space="preserve">Numerical Stability</w:t>
-      </w:r>
-      <w:bookmarkEnd w:id="127"/>
-    </w:p>
-    <w:p>
-      <w:pPr>
-        <w:pStyle w:val="FirstParagraph"/>
-      </w:pPr>
-      <w:r>
-        <w:t xml:space="preserve">Stability score from</w:t>
-      </w:r>
-      <w:r>
-        <w:t xml:space="preserve"> </w:t>
-      </w:r>
-      <w:r>
-        <w:rPr>
-          <w:rStyle w:val="VerbatimChar"/>
-        </w:rPr>
-        <w:t xml:space="preserve">infrastructure.scientific.stability</w:t>
-      </w:r>
-      <w:r>
-        <w:t xml:space="preserve">:</w:t>
-      </w:r>
-      <w:r>
-        <w:t xml:space="preserve"> </w:t>
-      </w:r>
-      <w:r>
-        <w:rPr>
-          <w:b/>
-          <w:bCs/>
-        </w:rPr>
-        <w:t xml:space="preserve">1.00</w:t>
-      </w:r>
-      <w:r>
-        <w:t xml:space="preserve"> </w:t>
-      </w:r>
-      <w:r>
-        <w:t xml:space="preserve">(out of 1.00)</w:t>
-      </w:r>
-    </w:p>
-    <w:p>
-      <w:pPr>
-        <w:pStyle w:val="BodyText"/>
-      </w:pPr>
-      <w:r>
-        <w:t xml:space="preserve">The stability analysis tested 48 parameter combinations (8 starting points</w:t>
-      </w:r>
-      <w:r>
-        <w:t xml:space="preserve"> </w:t>
-      </w:r>
-      <m:oMath>
-        <m:r>
-          <m:rPr>
-            <m:sty m:val="p"/>
-          </m:rPr>
-          <m:t>×</m:t>
-        </m:r>
-      </m:oMath>
-      <w:r>
-        <w:t xml:space="preserve"> </w:t>
-      </w:r>
-      <w:r>
-        <w:t xml:space="preserve">6 step sizes), recording termination accuracy across this finite gradient-descent grid. This is distinct from the reported stability score, which checks scalar objective evaluations and does not certify convergence of every optimization trajectory.</w:t>
-      </w:r>
-    </w:p>
-    <w:p>
-      <w:pPr>
-        <w:pStyle w:val="Heading3"/>
-      </w:pPr>
-      <w:bookmarkStart w:id="128" w:name="_6c42cec90fe9908a3afc8180d256cd7126ebccf"/>
-      <w:r>
-        <w:t xml:space="preserve">Benchmark Demonstration</w:t>
-      </w:r>
-      <w:bookmarkEnd w:id="128"/>
-    </w:p>
-    <w:p>
-      <w:pPr>
-        <w:pStyle w:val="FirstParagraph"/>
-      </w:pPr>
-      <w:r>
-        <w:t xml:space="preserve">This exemplar also demonstrates</w:t>
-      </w:r>
-      <w:r>
-        <w:t xml:space="preserve"> </w:t>
-      </w:r>
-      <w:r>
-        <w:rPr>
-          <w:rStyle w:val="VerbatimChar"/>
-        </w:rPr>
-        <w:t xml:space="preserve">infrastructure.benchmark</w:t>
-      </w:r>
-      <w:r>
-        <w:t xml:space="preserve">. The thin orchestrator</w:t>
-      </w:r>
-      <w:r>
-        <w:t xml:space="preserve"> </w:t>
-      </w:r>
-      <w:r>
-        <w:rPr>
-          <w:rStyle w:val="VerbatimChar"/>
-        </w:rPr>
-        <w:t xml:space="preserve">scripts/04_benchmark_stage.py</w:t>
-      </w:r>
-      <w:r>
-        <w:t xml:space="preserve"> </w:t>
-      </w:r>
-      <w:r>
-        <w:t xml:space="preserve">calls</w:t>
-      </w:r>
-      <w:r>
-        <w:t xml:space="preserve"> </w:t>
-      </w:r>
-      <w:r>
-        <w:rPr>
-          <w:rStyle w:val="VerbatimChar"/>
-        </w:rPr>
-        <w:t xml:space="preserve">src/template_code_project/core/benchmark_support.py</w:t>
-      </w:r>
-      <w:r>
-        <w:t xml:space="preserve">, which evaluates the pure</w:t>
-      </w:r>
-      <w:r>
-        <w:t xml:space="preserve"> </w:t>
-      </w:r>
-      <w:r>
-        <w:rPr>
-          <w:rStyle w:val="VerbatimChar"/>
-        </w:rPr>
-        <w:t xml:space="preserve">quadratic_function</w:t>
-      </w:r>
-      <w:r>
-        <w:t xml:space="preserve"> </w:t>
-      </w:r>
-      <w:r>
-        <w:t xml:space="preserve">across fixed seeded inputs and turns reproducible completion, finiteness, and output-stability facts into boolean rubric checks. Those checks are scored through</w:t>
-      </w:r>
-      <w:r>
-        <w:t xml:space="preserve"> </w:t>
-      </w:r>
-      <w:r>
-        <w:rPr>
-          <w:rStyle w:val="VerbatimChar"/>
-        </w:rPr>
-        <w:t xml:space="preserve">infrastructure.benchmark.score_rubric</w:t>
-      </w:r>
-      <w:r>
-        <w:t xml:space="preserve"> </w:t>
-      </w:r>
-      <w:r>
-        <w:t xml:space="preserve">against a weighted</w:t>
-      </w:r>
-      <w:r>
-        <w:t xml:space="preserve"> </w:t>
-      </w:r>
-      <w:r>
-        <w:rPr>
-          <w:rStyle w:val="VerbatimChar"/>
-        </w:rPr>
-        <w:t xml:space="preserve">RubricSet</w:t>
-      </w:r>
-      <w:r>
-        <w:t xml:space="preserve">, then rendered with</w:t>
-      </w:r>
-      <w:r>
-        <w:t xml:space="preserve"> </w:t>
-      </w:r>
-      <w:r>
-        <w:rPr>
-          <w:rStyle w:val="VerbatimChar"/>
-        </w:rPr>
-        <w:t xml:space="preserve">scores_to_markdown</w:t>
-      </w:r>
-      <w:r>
-        <w:t xml:space="preserve"> </w:t>
-      </w:r>
-      <w:r>
-        <w:t xml:space="preserve">into the byte-stable</w:t>
-      </w:r>
-      <w:r>
-        <w:t xml:space="preserve"> </w:t>
-      </w:r>
-      <w:r>
-        <w:rPr>
-          <w:rStyle w:val="VerbatimChar"/>
-        </w:rPr>
-        <w:t xml:space="preserve">output/reports/benchmark_report.json</w:t>
-      </w:r>
-      <w:r>
-        <w:t xml:space="preserve"> </w:t>
-      </w:r>
-      <w:r>
-        <w:t xml:space="preserve">with a deterministic objective-value figure. Real timing still executes as a runtime diagnostic, but it is not serialized into tracked evidence.</w:t>
-      </w:r>
-    </w:p>
-    <w:p>
-      <w:pPr>
-        <w:pStyle w:val="Heading2"/>
-      </w:pPr>
-      <w:bookmarkStart w:id="129" w:name="_564408ffc851f75235d2c44bd009977523cbdc8"/>
-      <w:r>
-        <w:t xml:space="preserve">Madlib Injection Verification</w:t>
-      </w:r>
-      <w:bookmarkEnd w:id="129"/>
-    </w:p>
-    <w:p>
-      <w:pPr>
-        <w:pStyle w:val="FirstParagraph"/>
-      </w:pPr>
-      <w:r>
-        <w:t xml:space="preserve">This manuscript demonstrates the template’s</w:t>
-      </w:r>
-      <w:r>
-        <w:t xml:space="preserve"> </w:t>
-      </w:r>
-      <w:r>
-        <w:t xml:space="preserve">“madlib”</w:t>
-      </w:r>
-      <w:r>
-        <w:t xml:space="preserve"> </w:t>
-      </w:r>
-      <w:r>
-        <w:t xml:space="preserve">capability: every quantitative claim is injected from computed data at render time. The substitution system processed the following variables:</w:t>
       </w:r>
     </w:p>
     <w:p>
@@ -15551,41 +15277,7 @@
         </w:numPr>
       </w:pPr>
       <w:r>
-        <w:rPr>
-          <w:b/>
-          <w:bCs/>
-        </w:rPr>
-        <w:t xml:space="preserve">Configuration variables</w:t>
-      </w:r>
-      <w:r>
-        <w:t xml:space="preserve">: Drawn from</w:t>
-      </w:r>
-      <w:r>
-        <w:t xml:space="preserve"> </w:t>
-      </w:r>
-      <w:r>
-        <w:rPr>
-          <w:rStyle w:val="VerbatimChar"/>
-        </w:rPr>
-        <w:t xml:space="preserve">manuscript/config.yaml</w:t>
-      </w:r>
-      <w:r>
-        <w:t xml:space="preserve"> </w:t>
-      </w:r>
-      <w:r>
-        <w:t xml:space="preserve">(</w:t>
-      </w:r>
-      <w:r>
-        <w:rPr>
-          <w:rStyle w:val="VerbatimChar"/>
-        </w:rPr>
-        <w:t xml:space="preserve">experiment:</w:t>
-      </w:r>
-      <w:r>
-        <w:t xml:space="preserve"> </w:t>
-      </w:r>
-      <w:r>
-        <w:t xml:space="preserve">section)</w:t>
+        <w:t xml:space="preserve">Non-convergent or hit-iteration-cap step sizes: 0.01, 2.5</w:t>
       </w:r>
     </w:p>
     <w:p>
@@ -15597,23 +15289,27 @@
         </w:numPr>
       </w:pPr>
       <w:r>
-        <w:rPr>
-          <w:b/>
-          <w:bCs/>
-        </w:rPr>
-        <w:t xml:space="preserve">Result variables</w:t>
-      </w:r>
-      <w:r>
-        <w:t xml:space="preserve">: Computed from</w:t>
-      </w:r>
-      <w:r>
-        <w:t xml:space="preserve"> </w:t>
-      </w:r>
-      <w:r>
-        <w:rPr>
-          <w:rStyle w:val="VerbatimChar"/>
-        </w:rPr>
-        <w:t xml:space="preserve">output/data/optimization_results.csv</w:t>
+        <w:t xml:space="preserve">Smallest recorded iteration count: 1 (at</w:t>
+      </w:r>
+      <w:r>
+        <w:t xml:space="preserve"> </w:t>
+      </w:r>
+      <m:oMath>
+        <m:r>
+          <m:t>α</m:t>
+        </m:r>
+        <m:r>
+          <m:rPr>
+            <m:sty m:val="p"/>
+          </m:rPr>
+          <m:t>=</m:t>
+        </m:r>
+        <m:r>
+          <m:t>1.0</m:t>
+        </m:r>
+      </m:oMath>
+      <w:r>
+        <w:t xml:space="preserve">)</w:t>
       </w:r>
     </w:p>
     <w:p>
@@ -15625,23 +15321,27 @@
         </w:numPr>
       </w:pPr>
       <w:r>
-        <w:rPr>
-          <w:b/>
-          <w:bCs/>
-        </w:rPr>
-        <w:t xml:space="preserve">Stability variables</w:t>
-      </w:r>
-      <w:r>
-        <w:t xml:space="preserve">: Extracted from</w:t>
-      </w:r>
-      <w:r>
-        <w:t xml:space="preserve"> </w:t>
-      </w:r>
-      <w:r>
-        <w:rPr>
-          <w:rStyle w:val="VerbatimChar"/>
-        </w:rPr>
-        <w:t xml:space="preserve">output/reports/stability_analysis.json</w:t>
+        <w:t xml:space="preserve">Largest recorded iteration count: 1000 (at</w:t>
+      </w:r>
+      <w:r>
+        <w:t xml:space="preserve"> </w:t>
+      </w:r>
+      <m:oMath>
+        <m:r>
+          <m:t>α</m:t>
+        </m:r>
+        <m:r>
+          <m:rPr>
+            <m:sty m:val="p"/>
+          </m:rPr>
+          <m:t>=</m:t>
+        </m:r>
+        <m:r>
+          <m:t>0.01</m:t>
+        </m:r>
+      </m:oMath>
+      <w:r>
+        <w:t xml:space="preserve">)</w:t>
       </w:r>
     </w:p>
     <w:p>
@@ -15653,329 +15353,238 @@
         </w:numPr>
       </w:pPr>
       <w:r>
+        <w:t xml:space="preserve">Mean iterations across all rows: 351</w:t>
+      </w:r>
+    </w:p>
+    <w:p>
+      <w:pPr>
+        <w:pStyle w:val="Heading3"/>
+      </w:pPr>
+      <w:bookmarkStart w:id="127" w:name="_a2edcaa346316b0bdc1134fa14e0ff53f35209c"/>
+      <w:r>
+        <w:t xml:space="preserve">Numerical Stability</w:t>
+      </w:r>
+      <w:bookmarkEnd w:id="127"/>
+    </w:p>
+    <w:p>
+      <w:pPr>
+        <w:pStyle w:val="FirstParagraph"/>
+      </w:pPr>
+      <w:r>
+        <w:t xml:space="preserve">Stability score from</w:t>
+      </w:r>
+      <w:r>
+        <w:t xml:space="preserve"> </w:t>
+      </w:r>
+      <w:r>
+        <w:rPr>
+          <w:rStyle w:val="VerbatimChar"/>
+        </w:rPr>
+        <w:t xml:space="preserve">infrastructure.scientific.stability</w:t>
+      </w:r>
+      <w:r>
+        <w:t xml:space="preserve">:</w:t>
+      </w:r>
+      <w:r>
+        <w:t xml:space="preserve"> </w:t>
+      </w:r>
+      <w:r>
         <w:rPr>
           <w:b/>
           <w:bCs/>
         </w:rPr>
-        <w:t xml:space="preserve">Provenance variables</w:t>
-      </w:r>
-      <w:r>
-        <w:t xml:space="preserve">: Generated at substitution time (timestamps, hashes, versions)</w:t>
-      </w:r>
+        <w:t xml:space="preserve">1.00</w:t>
+      </w:r>
+      <w:r>
+        <w:t xml:space="preserve"> </w:t>
+      </w:r>
+      <w:r>
+        <w:t xml:space="preserve">(out of 1.00)</w:t>
+      </w:r>
+    </w:p>
+    <w:p>
+      <w:pPr>
+        <w:pStyle w:val="BodyText"/>
+      </w:pPr>
+      <w:r>
+        <w:t xml:space="preserve">The stability analysis tested 48 parameter combinations (8 starting points</w:t>
+      </w:r>
+      <w:r>
+        <w:t xml:space="preserve"> </w:t>
+      </w:r>
+      <m:oMath>
+        <m:r>
+          <m:rPr>
+            <m:sty m:val="p"/>
+          </m:rPr>
+          <m:t>×</m:t>
+        </m:r>
+      </m:oMath>
+      <w:r>
+        <w:t xml:space="preserve"> </w:t>
+      </w:r>
+      <w:r>
+        <w:t xml:space="preserve">6 step sizes), recording termination accuracy across this finite gradient-descent grid. This is distinct from the reported stability score, which checks scalar objective evaluations and does not certify convergence of every optimization trajectory.</w:t>
+      </w:r>
+    </w:p>
+    <w:p>
+      <w:pPr>
+        <w:pStyle w:val="Heading3"/>
+      </w:pPr>
+      <w:bookmarkStart w:id="128" w:name="_6c42cec90fe9908a3afc8180d256cd7126ebccf"/>
+      <w:r>
+        <w:t xml:space="preserve">Benchmark Demonstration</w:t>
+      </w:r>
+      <w:bookmarkEnd w:id="128"/>
     </w:p>
     <w:p>
       <w:pPr>
         <w:pStyle w:val="FirstParagraph"/>
       </w:pPr>
       <w:r>
-        <w:t xml:space="preserve">To verify: modifying any value in</w:t>
-      </w:r>
-      <w:r>
-        <w:t xml:space="preserve"> </w:t>
-      </w:r>
-      <w:r>
-        <w:rPr>
-          <w:rStyle w:val="VerbatimChar"/>
-        </w:rPr>
-        <w:t xml:space="preserve">config.yaml</w:t>
-      </w:r>
-      <w:r>
-        <w:t xml:space="preserve"> </w:t>
-      </w:r>
-      <w:r>
-        <w:t xml:space="preserve">and re-running the pipeline will automatically update every corresponding claim in this document. No manual transcription is required or permitted.</w:t>
-      </w:r>
-    </w:p>
-    <w:p>
-      <w:r>
-        <w:br w:type="page"/>
-      </w:r>
-    </w:p>
-    <w:p>
-      <w:pPr>
-        <w:pStyle w:val="Heading1"/>
-      </w:pPr>
-      <w:bookmarkStart w:id="130" w:name="_b2eb09406cdf2fc718e9f5f7396436686210cad"/>
-      <w:r>
-        <w:t xml:space="preserve">Scope, Related Work, and Positioning</w:t>
-      </w:r>
-      <w:bookmarkEnd w:id="130"/>
+        <w:t xml:space="preserve">This exemplar also demonstrates</w:t>
+      </w:r>
+      <w:r>
+        <w:t xml:space="preserve"> </w:t>
+      </w:r>
+      <w:r>
+        <w:rPr>
+          <w:rStyle w:val="VerbatimChar"/>
+        </w:rPr>
+        <w:t xml:space="preserve">infrastructure.benchmark</w:t>
+      </w:r>
+      <w:r>
+        <w:t xml:space="preserve">. The thin orchestrator</w:t>
+      </w:r>
+      <w:r>
+        <w:t xml:space="preserve"> </w:t>
+      </w:r>
+      <w:r>
+        <w:rPr>
+          <w:rStyle w:val="VerbatimChar"/>
+        </w:rPr>
+        <w:t xml:space="preserve">scripts/04_benchmark_stage.py</w:t>
+      </w:r>
+      <w:r>
+        <w:t xml:space="preserve"> </w:t>
+      </w:r>
+      <w:r>
+        <w:t xml:space="preserve">calls</w:t>
+      </w:r>
+      <w:r>
+        <w:t xml:space="preserve"> </w:t>
+      </w:r>
+      <w:r>
+        <w:rPr>
+          <w:rStyle w:val="VerbatimChar"/>
+        </w:rPr>
+        <w:t xml:space="preserve">src/template_code_project/core/benchmark_support.py</w:t>
+      </w:r>
+      <w:r>
+        <w:t xml:space="preserve">, which evaluates the pure</w:t>
+      </w:r>
+      <w:r>
+        <w:t xml:space="preserve"> </w:t>
+      </w:r>
+      <w:r>
+        <w:rPr>
+          <w:rStyle w:val="VerbatimChar"/>
+        </w:rPr>
+        <w:t xml:space="preserve">quadratic_function</w:t>
+      </w:r>
+      <w:r>
+        <w:t xml:space="preserve"> </w:t>
+      </w:r>
+      <w:r>
+        <w:t xml:space="preserve">across fixed seeded inputs and turns reproducible completion, finiteness, and output-stability facts into boolean rubric checks. Those checks are scored through</w:t>
+      </w:r>
+      <w:r>
+        <w:t xml:space="preserve"> </w:t>
+      </w:r>
+      <w:r>
+        <w:rPr>
+          <w:rStyle w:val="VerbatimChar"/>
+        </w:rPr>
+        <w:t xml:space="preserve">infrastructure.benchmark.score_rubric</w:t>
+      </w:r>
+      <w:r>
+        <w:t xml:space="preserve"> </w:t>
+      </w:r>
+      <w:r>
+        <w:t xml:space="preserve">against a weighted</w:t>
+      </w:r>
+      <w:r>
+        <w:t xml:space="preserve"> </w:t>
+      </w:r>
+      <w:r>
+        <w:rPr>
+          <w:rStyle w:val="VerbatimChar"/>
+        </w:rPr>
+        <w:t xml:space="preserve">RubricSet</w:t>
+      </w:r>
+      <w:r>
+        <w:t xml:space="preserve">, then rendered with</w:t>
+      </w:r>
+      <w:r>
+        <w:t xml:space="preserve"> </w:t>
+      </w:r>
+      <w:r>
+        <w:rPr>
+          <w:rStyle w:val="VerbatimChar"/>
+        </w:rPr>
+        <w:t xml:space="preserve">scores_to_markdown</w:t>
+      </w:r>
+      <w:r>
+        <w:t xml:space="preserve"> </w:t>
+      </w:r>
+      <w:r>
+        <w:t xml:space="preserve">into the byte-stable</w:t>
+      </w:r>
+      <w:r>
+        <w:t xml:space="preserve"> </w:t>
+      </w:r>
+      <w:r>
+        <w:rPr>
+          <w:rStyle w:val="VerbatimChar"/>
+        </w:rPr>
+        <w:t xml:space="preserve">output/reports/benchmark_report.json</w:t>
+      </w:r>
+      <w:r>
+        <w:t xml:space="preserve"> </w:t>
+      </w:r>
+      <w:r>
+        <w:t xml:space="preserve">with a deterministic objective-value figure. Real timing still executes as a runtime diagnostic, but it is not serialized into tracked evidence.</w:t>
+      </w:r>
+    </w:p>
+    <w:p>
+      <w:pPr>
+        <w:pStyle w:val="Heading2"/>
+      </w:pPr>
+      <w:bookmarkStart w:id="129" w:name="_564408ffc851f75235d2c44bd009977523cbdc8"/>
+      <w:r>
+        <w:t xml:space="preserve">Madlib Injection Verification</w:t>
+      </w:r>
+      <w:bookmarkEnd w:id="129"/>
     </w:p>
     <w:p>
       <w:pPr>
         <w:pStyle w:val="FirstParagraph"/>
       </w:pPr>
       <w:r>
-        <w:t xml:space="preserve">This section situates the exemplar scientifically and states explicit boundaries. The goal is not to compete with monographs on nonlinear programming</w:t>
-      </w:r>
-      <w:r>
-        <w:t xml:space="preserve"> </w:t>
-      </w:r>
-      <w:r>
-        <w:t xml:space="preserve">(Nocedal and Wright 2006; Bertsekas 1999)</w:t>
-      </w:r>
-      <w:r>
-        <w:t xml:space="preserve">, but to show how a minimal, test-backed optimization story fits the template’s reproducibility and rendering stack</w:t>
-      </w:r>
-      <w:r>
-        <w:t xml:space="preserve"> </w:t>
-      </w:r>
-      <w:r>
-        <w:t xml:space="preserve">(Peng 2011)</w:t>
-      </w:r>
-      <w:r>
-        <w:t xml:space="preserve">.</w:t>
-      </w:r>
-    </w:p>
-    <w:p>
-      <w:pPr>
-        <w:pStyle w:val="Heading2"/>
-      </w:pPr>
-      <w:bookmarkStart w:id="131" w:name="_ac53267b030ea524116bfa017547ef5a584ea85"/>
-      <w:r>
-        <w:t xml:space="preserve">Classical gradient methods</w:t>
-      </w:r>
-      <w:bookmarkEnd w:id="131"/>
-    </w:p>
-    <w:p>
-      <w:pPr>
-        <w:pStyle w:val="FirstParagraph"/>
-      </w:pPr>
-      <w:r>
-        <w:t xml:space="preserve">Smooth unconstrained minimization via first-order updates has a long lineage, from Cauchy’s early descent perspective</w:t>
-      </w:r>
-      <w:r>
-        <w:t xml:space="preserve"> </w:t>
-      </w:r>
-      <w:r>
-        <w:t xml:space="preserve">(Cauchy 1847)</w:t>
-      </w:r>
-      <w:r>
-        <w:t xml:space="preserve"> </w:t>
-      </w:r>
-      <w:r>
-        <w:t xml:space="preserve">to modern treatments of convex problems</w:t>
-      </w:r>
-      <w:r>
-        <w:t xml:space="preserve"> </w:t>
-      </w:r>
-      <w:r>
-        <w:t xml:space="preserve">(Boyd and Vandenberghe 2004)</w:t>
-      </w:r>
-      <w:r>
-        <w:t xml:space="preserve"> </w:t>
-      </w:r>
-      <w:r>
-        <w:t xml:space="preserve">and accelerated gradient schemes</w:t>
-      </w:r>
-      <w:r>
-        <w:t xml:space="preserve"> </w:t>
-      </w:r>
-      <w:r>
-        <w:t xml:space="preserve">(Nesterov 2013)</w:t>
-      </w:r>
-      <w:r>
-        <w:t xml:space="preserve">. Polyak’s classical discussion of gradient convergence factors remains relevant when interpreting empirical iteration counts</w:t>
-      </w:r>
-      <w:r>
-        <w:t xml:space="preserve"> </w:t>
-      </w:r>
-      <w:r>
-        <w:t xml:space="preserve">(Polyak 1964)</w:t>
-      </w:r>
-      <w:r>
-        <w:t xml:space="preserve">. The present manuscript restricts attention to</w:t>
-      </w:r>
-      <w:r>
-        <w:t xml:space="preserve"> </w:t>
-      </w:r>
-      <w:r>
-        <w:rPr>
-          <w:b/>
-          <w:bCs/>
-        </w:rPr>
-        <w:t xml:space="preserve">fixed-step</w:t>
-      </w:r>
-      <w:r>
-        <w:t xml:space="preserve"> </w:t>
-      </w:r>
-      <w:r>
-        <w:t xml:space="preserve">gradient descent on a</w:t>
-      </w:r>
-      <w:r>
-        <w:t xml:space="preserve"> </w:t>
-      </w:r>
-      <w:r>
-        <w:rPr>
-          <w:b/>
-          <w:bCs/>
-        </w:rPr>
-        <w:t xml:space="preserve">convex quadratic</w:t>
-      </w:r>
-      <w:r>
-        <w:t xml:space="preserve">, where rates reduce to scalar linear recurrences in the error (sec. 4, eq. 4).</w:t>
-      </w:r>
-    </w:p>
-    <w:p>
-      <w:pPr>
-        <w:pStyle w:val="Heading2"/>
-      </w:pPr>
-      <w:bookmarkStart w:id="132" w:name="_05ac0fb7f764cd7504cce46d53f44b6e6097ba8"/>
-      <w:r>
-        <w:t xml:space="preserve">Adaptive and stochastic extensions</w:t>
-      </w:r>
-      <w:bookmarkEnd w:id="132"/>
-    </w:p>
-    <w:p>
-      <w:pPr>
-        <w:pStyle w:val="FirstParagraph"/>
-      </w:pPr>
-      <w:r>
-        <w:t xml:space="preserve">Practical machine-learning optimizers (e.g., Adam</w:t>
-      </w:r>
-      <w:r>
-        <w:t xml:space="preserve"> </w:t>
-      </w:r>
-      <w:r>
-        <w:t xml:space="preserve">(Kingma and Ba 2015)</w:t>
-      </w:r>
-      <w:r>
-        <w:t xml:space="preserve">) introduce momentum, adaptive preconditioning, or noise from minibatching. Those methods are</w:t>
-      </w:r>
-      <w:r>
-        <w:t xml:space="preserve"> </w:t>
-      </w:r>
-      <w:r>
-        <w:rPr>
-          <w:b/>
-          <w:bCs/>
-        </w:rPr>
-        <w:t xml:space="preserve">out of scope</w:t>
-      </w:r>
-      <w:r>
-        <w:t xml:space="preserve"> </w:t>
-      </w:r>
-      <w:r>
-        <w:t xml:space="preserve">for</w:t>
-      </w:r>
-      <w:r>
-        <w:t xml:space="preserve"> </w:t>
-      </w:r>
-      <w:r>
-        <w:rPr>
-          <w:rStyle w:val="VerbatimChar"/>
-        </w:rPr>
-        <w:t xml:space="preserve">template_code_project</w:t>
-      </w:r>
-      <w:r>
-        <w:t xml:space="preserve">: the exemplar deliberately keeps the algorithm minimal so that failures (divergent</w:t>
-      </w:r>
-      <w:r>
-        <w:t xml:space="preserve"> </w:t>
-      </w:r>
-      <m:oMath>
-        <m:r>
-          <m:t>α</m:t>
-        </m:r>
-      </m:oMath>
-      <w:r>
-        <w:t xml:space="preserve">, iteration caps) are interpretable without confounding from stochastic sampling or line-search logic.</w:t>
-      </w:r>
-    </w:p>
-    <w:p>
-      <w:pPr>
-        <w:pStyle w:val="Heading2"/>
-      </w:pPr>
-      <w:bookmarkStart w:id="133" w:name="_3bc48e80992a743b1055962b61fae9f317fec48"/>
-      <w:r>
-        <w:t xml:space="preserve">What this project proves about the template</w:t>
-      </w:r>
-      <w:bookmarkEnd w:id="133"/>
-    </w:p>
-    <w:p>
-      <w:pPr>
-        <w:pStyle w:val="FirstParagraph"/>
-      </w:pPr>
-      <w:r>
-        <w:t xml:space="preserve">The scientific claims through sec. 2, sec. 3, and sec. 4 are standard textbook material. The</w:t>
-      </w:r>
-      <w:r>
-        <w:t xml:space="preserve"> </w:t>
-      </w:r>
-      <w:r>
-        <w:rPr>
-          <w:b/>
-          <w:bCs/>
-        </w:rPr>
-        <w:t xml:space="preserve">non-standard</w:t>
-      </w:r>
-      <w:r>
-        <w:t xml:space="preserve"> </w:t>
-      </w:r>
-      <w:r>
-        <w:t xml:space="preserve">contribution is procedural: configuration in</w:t>
-      </w:r>
-      <w:r>
-        <w:t xml:space="preserve"> </w:t>
-      </w:r>
-      <w:r>
-        <w:rPr>
-          <w:rStyle w:val="VerbatimChar"/>
-        </w:rPr>
-        <w:t xml:space="preserve">manuscript/config.yaml</w:t>
-      </w:r>
-      <w:r>
-        <w:t xml:space="preserve"> </w:t>
-      </w:r>
-      <w:r>
-        <w:t xml:space="preserve">drives</w:t>
-      </w:r>
-      <w:r>
-        <w:t xml:space="preserve"> </w:t>
-      </w:r>
-      <w:r>
-        <w:rPr>
-          <w:rStyle w:val="VerbatimChar"/>
-        </w:rPr>
-        <w:t xml:space="preserve">run_convergence_experiment()</w:t>
-      </w:r>
-      <w:r>
-        <w:t xml:space="preserve">, figures, CSV exports, and</w:t>
-      </w:r>
-      <w:r>
-        <w:t xml:space="preserve"> </w:t>
-      </w:r>
-      <w:r>
-        <w:rPr>
-          <w:rStyle w:val="VerbatimChar"/>
-        </w:rPr>
-        <w:t xml:space="preserve">RESULT_*</w:t>
-      </w:r>
-      <w:r>
-        <w:t xml:space="preserve"> </w:t>
-      </w:r>
-      <w:r>
-        <w:t xml:space="preserve">token substitution (</w:t>
-      </w:r>
-      <w:r>
-        <w:rPr>
-          <w:rStyle w:val="VerbatimChar"/>
-        </w:rPr>
-        <w:t xml:space="preserve">scripts/z_generate_manuscript_variables.py</w:t>
-      </w:r>
-      <w:r>
-        <w:t xml:space="preserve">) so that PDF, HTML, and validation logs refer to the same numbers. That pattern is what downstream projects should copy—whether the domain is optimization, differential equations, or Bayesian workflows.</w:t>
-      </w:r>
-    </w:p>
-    <w:p>
-      <w:pPr>
-        <w:pStyle w:val="Heading2"/>
-      </w:pPr>
-      <w:bookmarkStart w:id="134" w:name="_a42444e030917023aae22b567c432c36f1ec4dd"/>
-      <w:r>
-        <w:t xml:space="preserve">Explicit limitations</w:t>
-      </w:r>
-      <w:bookmarkEnd w:id="134"/>
+        <w:t xml:space="preserve">This manuscript demonstrates the template’s</w:t>
+      </w:r>
+      <w:r>
+        <w:t xml:space="preserve"> </w:t>
+      </w:r>
+      <w:r>
+        <w:t xml:space="preserve">“madlib”</w:t>
+      </w:r>
+      <w:r>
+        <w:t xml:space="preserve"> </w:t>
+      </w:r>
+      <w:r>
+        <w:t xml:space="preserve">capability: every quantitative claim is injected from computed data at render time. The substitution system processed the following variables:</w:t>
+      </w:r>
     </w:p>
     <w:p>
       <w:pPr>
@@ -15990,79 +15599,37 @@
           <w:b/>
           <w:bCs/>
         </w:rPr>
-        <w:t xml:space="preserve">Dimensionality</w:t>
-      </w:r>
-      <w:r>
-        <w:t xml:space="preserve">: Default experiments emphasize</w:t>
-      </w:r>
-      <w:r>
-        <w:t xml:space="preserve"> </w:t>
-      </w:r>
-      <m:oMath>
-        <m:r>
-          <m:t>d</m:t>
-        </m:r>
-        <m:r>
-          <m:rPr>
-            <m:sty m:val="p"/>
-          </m:rPr>
-          <m:t>=</m:t>
-        </m:r>
-        <m:r>
-          <m:t>1</m:t>
-        </m:r>
-      </m:oMath>
-      <w:r>
-        <w:t xml:space="preserve"> </w:t>
-      </w:r>
-      <w:r>
-        <w:t xml:space="preserve">with</w:t>
-      </w:r>
-      <w:r>
-        <w:t xml:space="preserve"> </w:t>
-      </w:r>
-      <m:oMath>
-        <m:r>
-          <m:t>A</m:t>
-        </m:r>
-        <m:r>
-          <m:rPr>
-            <m:sty m:val="p"/>
-          </m:rPr>
-          <m:t>=</m:t>
-        </m:r>
-        <m:r>
-          <m:t>I</m:t>
-        </m:r>
-      </m:oMath>
-      <w:r>
-        <w:t xml:space="preserve"> </w:t>
-      </w:r>
-      <w:r>
-        <w:t xml:space="preserve">for transparent plotting; the benchmark figure explores</w:t>
-      </w:r>
-      <w:r>
-        <w:t xml:space="preserve"> </w:t>
-      </w:r>
-      <m:oMath>
-        <m:r>
-          <m:t>d</m:t>
-        </m:r>
-        <m:r>
-          <m:rPr>
-            <m:sty m:val="p"/>
-          </m:rPr>
-          <m:t>&gt;</m:t>
-        </m:r>
-        <m:r>
-          <m:t>1</m:t>
-        </m:r>
-      </m:oMath>
-      <w:r>
-        <w:t xml:space="preserve"> </w:t>
-      </w:r>
-      <w:r>
-        <w:t xml:space="preserve">only with identity Hessians, so no ill-conditioning effects appear.</w:t>
+        <w:t xml:space="preserve">Configuration variables</w:t>
+      </w:r>
+      <w:r>
+        <w:t xml:space="preserve">: Drawn from</w:t>
+      </w:r>
+      <w:r>
+        <w:t xml:space="preserve"> </w:t>
+      </w:r>
+      <w:r>
+        <w:rPr>
+          <w:rStyle w:val="VerbatimChar"/>
+        </w:rPr>
+        <w:t xml:space="preserve">manuscript/config.yaml</w:t>
+      </w:r>
+      <w:r>
+        <w:t xml:space="preserve"> </w:t>
+      </w:r>
+      <w:r>
+        <w:t xml:space="preserve">(</w:t>
+      </w:r>
+      <w:r>
+        <w:rPr>
+          <w:rStyle w:val="VerbatimChar"/>
+        </w:rPr>
+        <w:t xml:space="preserve">experiment:</w:t>
+      </w:r>
+      <w:r>
+        <w:t xml:space="preserve"> </w:t>
+      </w:r>
+      <w:r>
+        <w:t xml:space="preserve">section)</w:t>
       </w:r>
     </w:p>
     <w:p>
@@ -16078,36 +15645,19 @@
           <w:b/>
           <w:bCs/>
         </w:rPr>
-        <w:t xml:space="preserve">Step-size policy</w:t>
-      </w:r>
-      <w:r>
-        <w:t xml:space="preserve">: Only constant</w:t>
-      </w:r>
-      <w:r>
-        <w:t xml:space="preserve"> </w:t>
-      </w:r>
-      <m:oMath>
-        <m:r>
-          <m:t>α</m:t>
-        </m:r>
-      </m:oMath>
-      <w:r>
-        <w:t xml:space="preserve"> </w:t>
-      </w:r>
-      <w:r>
-        <w:t xml:space="preserve">is implemented in</w:t>
-      </w:r>
-      <w:r>
-        <w:t xml:space="preserve"> </w:t>
-      </w:r>
-      <w:r>
-        <w:rPr>
-          <w:rStyle w:val="VerbatimChar"/>
-        </w:rPr>
-        <w:t xml:space="preserve">src/template_code_project/core/optimizer.py</w:t>
-      </w:r>
-      <w:r>
-        <w:t xml:space="preserve">; there is no Wolfe or Armijo backtracking.</w:t>
+        <w:t xml:space="preserve">Result variables</w:t>
+      </w:r>
+      <w:r>
+        <w:t xml:space="preserve">: Computed from</w:t>
+      </w:r>
+      <w:r>
+        <w:t xml:space="preserve"> </w:t>
+      </w:r>
+      <w:r>
+        <w:rPr>
+          <w:rStyle w:val="VerbatimChar"/>
+        </w:rPr>
+        <w:t xml:space="preserve">output/data/optimization_results.csv</w:t>
       </w:r>
     </w:p>
     <w:p>
@@ -16123,10 +15673,19 @@
           <w:b/>
           <w:bCs/>
         </w:rPr>
-        <w:t xml:space="preserve">Global optimization</w:t>
-      </w:r>
-      <w:r>
-        <w:t xml:space="preserve">: Convexity is assumed; no basin-hopping or restarts are studied.</w:t>
+        <w:t xml:space="preserve">Stability variables</w:t>
+      </w:r>
+      <w:r>
+        <w:t xml:space="preserve">: Extracted from</w:t>
+      </w:r>
+      <w:r>
+        <w:t xml:space="preserve"> </w:t>
+      </w:r>
+      <w:r>
+        <w:rPr>
+          <w:rStyle w:val="VerbatimChar"/>
+        </w:rPr>
+        <w:t xml:space="preserve">output/reports/stability_analysis.json</w:t>
       </w:r>
     </w:p>
     <w:p>
@@ -16135,6 +15694,491 @@
         <w:numPr>
           <w:ilvl w:val="0"/>
           <w:numId w:val="1031"/>
+        </w:numPr>
+      </w:pPr>
+      <w:r>
+        <w:rPr>
+          <w:b/>
+          <w:bCs/>
+        </w:rPr>
+        <w:t xml:space="preserve">Provenance variables</w:t>
+      </w:r>
+      <w:r>
+        <w:t xml:space="preserve">: Generated at substitution time (timestamps, hashes, versions)</w:t>
+      </w:r>
+    </w:p>
+    <w:p>
+      <w:pPr>
+        <w:pStyle w:val="FirstParagraph"/>
+      </w:pPr>
+      <w:r>
+        <w:t xml:space="preserve">To verify: modifying any value in</w:t>
+      </w:r>
+      <w:r>
+        <w:t xml:space="preserve"> </w:t>
+      </w:r>
+      <w:r>
+        <w:rPr>
+          <w:rStyle w:val="VerbatimChar"/>
+        </w:rPr>
+        <w:t xml:space="preserve">config.yaml</w:t>
+      </w:r>
+      <w:r>
+        <w:t xml:space="preserve"> </w:t>
+      </w:r>
+      <w:r>
+        <w:t xml:space="preserve">and re-running the pipeline will automatically update every corresponding claim in this document. No manual transcription is required or permitted.</w:t>
+      </w:r>
+    </w:p>
+    <w:p>
+      <w:r>
+        <w:br w:type="page"/>
+      </w:r>
+    </w:p>
+    <w:p>
+      <w:pPr>
+        <w:pStyle w:val="Heading1"/>
+      </w:pPr>
+      <w:bookmarkStart w:id="130" w:name="_b2eb09406cdf2fc718e9f5f7396436686210cad"/>
+      <w:r>
+        <w:t xml:space="preserve">Scope, Related Work, and Positioning</w:t>
+      </w:r>
+      <w:bookmarkEnd w:id="130"/>
+    </w:p>
+    <w:p>
+      <w:pPr>
+        <w:pStyle w:val="FirstParagraph"/>
+      </w:pPr>
+      <w:r>
+        <w:t xml:space="preserve">This section situates the exemplar scientifically and states explicit boundaries. The goal is not to compete with monographs on nonlinear programming</w:t>
+      </w:r>
+      <w:r>
+        <w:t xml:space="preserve"> </w:t>
+      </w:r>
+      <w:r>
+        <w:t xml:space="preserve">(Nocedal and Wright 2006; Bertsekas 1999)</w:t>
+      </w:r>
+      <w:r>
+        <w:t xml:space="preserve">, but to show how a minimal, test-backed optimization story fits the template’s reproducibility and rendering stack</w:t>
+      </w:r>
+      <w:r>
+        <w:t xml:space="preserve"> </w:t>
+      </w:r>
+      <w:r>
+        <w:t xml:space="preserve">(Peng 2011)</w:t>
+      </w:r>
+      <w:r>
+        <w:t xml:space="preserve">.</w:t>
+      </w:r>
+    </w:p>
+    <w:p>
+      <w:pPr>
+        <w:pStyle w:val="Heading2"/>
+      </w:pPr>
+      <w:bookmarkStart w:id="131" w:name="_ac53267b030ea524116bfa017547ef5a584ea85"/>
+      <w:r>
+        <w:t xml:space="preserve">Classical gradient methods</w:t>
+      </w:r>
+      <w:bookmarkEnd w:id="131"/>
+    </w:p>
+    <w:p>
+      <w:pPr>
+        <w:pStyle w:val="FirstParagraph"/>
+      </w:pPr>
+      <w:r>
+        <w:t xml:space="preserve">Smooth unconstrained minimization via first-order updates has a long lineage, from Cauchy’s early descent perspective</w:t>
+      </w:r>
+      <w:r>
+        <w:t xml:space="preserve"> </w:t>
+      </w:r>
+      <w:r>
+        <w:t xml:space="preserve">(Cauchy 1847)</w:t>
+      </w:r>
+      <w:r>
+        <w:t xml:space="preserve"> </w:t>
+      </w:r>
+      <w:r>
+        <w:t xml:space="preserve">to modern treatments of convex problems</w:t>
+      </w:r>
+      <w:r>
+        <w:t xml:space="preserve"> </w:t>
+      </w:r>
+      <w:r>
+        <w:t xml:space="preserve">(Boyd and Vandenberghe 2004)</w:t>
+      </w:r>
+      <w:r>
+        <w:t xml:space="preserve"> </w:t>
+      </w:r>
+      <w:r>
+        <w:t xml:space="preserve">and accelerated gradient schemes</w:t>
+      </w:r>
+      <w:r>
+        <w:t xml:space="preserve"> </w:t>
+      </w:r>
+      <w:r>
+        <w:t xml:space="preserve">(Nesterov 2013)</w:t>
+      </w:r>
+      <w:r>
+        <w:t xml:space="preserve">. Polyak’s classical discussion of gradient convergence factors remains relevant when interpreting empirical iteration counts</w:t>
+      </w:r>
+      <w:r>
+        <w:t xml:space="preserve"> </w:t>
+      </w:r>
+      <w:r>
+        <w:t xml:space="preserve">(Polyak 1964)</w:t>
+      </w:r>
+      <w:r>
+        <w:t xml:space="preserve">. The present manuscript restricts attention to</w:t>
+      </w:r>
+      <w:r>
+        <w:t xml:space="preserve"> </w:t>
+      </w:r>
+      <w:r>
+        <w:rPr>
+          <w:b/>
+          <w:bCs/>
+        </w:rPr>
+        <w:t xml:space="preserve">fixed-step</w:t>
+      </w:r>
+      <w:r>
+        <w:t xml:space="preserve"> </w:t>
+      </w:r>
+      <w:r>
+        <w:t xml:space="preserve">gradient descent on a</w:t>
+      </w:r>
+      <w:r>
+        <w:t xml:space="preserve"> </w:t>
+      </w:r>
+      <w:r>
+        <w:rPr>
+          <w:b/>
+          <w:bCs/>
+        </w:rPr>
+        <w:t xml:space="preserve">convex quadratic</w:t>
+      </w:r>
+      <w:r>
+        <w:t xml:space="preserve">, where rates reduce to scalar linear recurrences in the error (sec. 4, eq. 4).</w:t>
+      </w:r>
+    </w:p>
+    <w:p>
+      <w:pPr>
+        <w:pStyle w:val="Heading2"/>
+      </w:pPr>
+      <w:bookmarkStart w:id="132" w:name="_05ac0fb7f764cd7504cce46d53f44b6e6097ba8"/>
+      <w:r>
+        <w:t xml:space="preserve">Adaptive and stochastic extensions</w:t>
+      </w:r>
+      <w:bookmarkEnd w:id="132"/>
+    </w:p>
+    <w:p>
+      <w:pPr>
+        <w:pStyle w:val="FirstParagraph"/>
+      </w:pPr>
+      <w:r>
+        <w:t xml:space="preserve">Practical machine-learning optimizers (e.g., Adam</w:t>
+      </w:r>
+      <w:r>
+        <w:t xml:space="preserve"> </w:t>
+      </w:r>
+      <w:r>
+        <w:t xml:space="preserve">(Kingma and Ba 2015)</w:t>
+      </w:r>
+      <w:r>
+        <w:t xml:space="preserve">) introduce momentum, adaptive preconditioning, or noise from minibatching. Those methods are</w:t>
+      </w:r>
+      <w:r>
+        <w:t xml:space="preserve"> </w:t>
+      </w:r>
+      <w:r>
+        <w:rPr>
+          <w:b/>
+          <w:bCs/>
+        </w:rPr>
+        <w:t xml:space="preserve">out of scope</w:t>
+      </w:r>
+      <w:r>
+        <w:t xml:space="preserve"> </w:t>
+      </w:r>
+      <w:r>
+        <w:t xml:space="preserve">for</w:t>
+      </w:r>
+      <w:r>
+        <w:t xml:space="preserve"> </w:t>
+      </w:r>
+      <w:r>
+        <w:rPr>
+          <w:rStyle w:val="VerbatimChar"/>
+        </w:rPr>
+        <w:t xml:space="preserve">template_code_project</w:t>
+      </w:r>
+      <w:r>
+        <w:t xml:space="preserve">: the exemplar deliberately keeps the algorithm minimal so that failures (divergent</w:t>
+      </w:r>
+      <w:r>
+        <w:t xml:space="preserve"> </w:t>
+      </w:r>
+      <m:oMath>
+        <m:r>
+          <m:t>α</m:t>
+        </m:r>
+      </m:oMath>
+      <w:r>
+        <w:t xml:space="preserve">, iteration caps) are interpretable without confounding from stochastic sampling or line-search logic.</w:t>
+      </w:r>
+    </w:p>
+    <w:p>
+      <w:pPr>
+        <w:pStyle w:val="Heading2"/>
+      </w:pPr>
+      <w:bookmarkStart w:id="133" w:name="_3bc48e80992a743b1055962b61fae9f317fec48"/>
+      <w:r>
+        <w:t xml:space="preserve">What this project proves about the template</w:t>
+      </w:r>
+      <w:bookmarkEnd w:id="133"/>
+    </w:p>
+    <w:p>
+      <w:pPr>
+        <w:pStyle w:val="FirstParagraph"/>
+      </w:pPr>
+      <w:r>
+        <w:t xml:space="preserve">The scientific claims through sec. 2, sec. 3, and sec. 4 are standard textbook material. The</w:t>
+      </w:r>
+      <w:r>
+        <w:t xml:space="preserve"> </w:t>
+      </w:r>
+      <w:r>
+        <w:rPr>
+          <w:b/>
+          <w:bCs/>
+        </w:rPr>
+        <w:t xml:space="preserve">non-standard</w:t>
+      </w:r>
+      <w:r>
+        <w:t xml:space="preserve"> </w:t>
+      </w:r>
+      <w:r>
+        <w:t xml:space="preserve">contribution is procedural: configuration in</w:t>
+      </w:r>
+      <w:r>
+        <w:t xml:space="preserve"> </w:t>
+      </w:r>
+      <w:r>
+        <w:rPr>
+          <w:rStyle w:val="VerbatimChar"/>
+        </w:rPr>
+        <w:t xml:space="preserve">manuscript/config.yaml</w:t>
+      </w:r>
+      <w:r>
+        <w:t xml:space="preserve"> </w:t>
+      </w:r>
+      <w:r>
+        <w:t xml:space="preserve">drives</w:t>
+      </w:r>
+      <w:r>
+        <w:t xml:space="preserve"> </w:t>
+      </w:r>
+      <w:r>
+        <w:rPr>
+          <w:rStyle w:val="VerbatimChar"/>
+        </w:rPr>
+        <w:t xml:space="preserve">run_convergence_experiment()</w:t>
+      </w:r>
+      <w:r>
+        <w:t xml:space="preserve">, figures, CSV exports, and</w:t>
+      </w:r>
+      <w:r>
+        <w:t xml:space="preserve"> </w:t>
+      </w:r>
+      <w:r>
+        <w:rPr>
+          <w:rStyle w:val="VerbatimChar"/>
+        </w:rPr>
+        <w:t xml:space="preserve">RESULT_*</w:t>
+      </w:r>
+      <w:r>
+        <w:t xml:space="preserve"> </w:t>
+      </w:r>
+      <w:r>
+        <w:t xml:space="preserve">token substitution (</w:t>
+      </w:r>
+      <w:r>
+        <w:rPr>
+          <w:rStyle w:val="VerbatimChar"/>
+        </w:rPr>
+        <w:t xml:space="preserve">scripts/z_generate_manuscript_variables.py</w:t>
+      </w:r>
+      <w:r>
+        <w:t xml:space="preserve">) so that PDF, HTML, and validation logs refer to the same numbers. That pattern is what downstream projects should copy—whether the domain is optimization, differential equations, or Bayesian workflows.</w:t>
+      </w:r>
+    </w:p>
+    <w:p>
+      <w:pPr>
+        <w:pStyle w:val="Heading2"/>
+      </w:pPr>
+      <w:bookmarkStart w:id="134" w:name="_a42444e030917023aae22b567c432c36f1ec4dd"/>
+      <w:r>
+        <w:t xml:space="preserve">Explicit limitations</w:t>
+      </w:r>
+      <w:bookmarkEnd w:id="134"/>
+    </w:p>
+    <w:p>
+      <w:pPr>
+        <w:pStyle w:val="Compact"/>
+        <w:numPr>
+          <w:ilvl w:val="0"/>
+          <w:numId w:val="1032"/>
+        </w:numPr>
+      </w:pPr>
+      <w:r>
+        <w:rPr>
+          <w:b/>
+          <w:bCs/>
+        </w:rPr>
+        <w:t xml:space="preserve">Dimensionality</w:t>
+      </w:r>
+      <w:r>
+        <w:t xml:space="preserve">: Default experiments emphasize</w:t>
+      </w:r>
+      <w:r>
+        <w:t xml:space="preserve"> </w:t>
+      </w:r>
+      <m:oMath>
+        <m:r>
+          <m:t>d</m:t>
+        </m:r>
+        <m:r>
+          <m:rPr>
+            <m:sty m:val="p"/>
+          </m:rPr>
+          <m:t>=</m:t>
+        </m:r>
+        <m:r>
+          <m:t>1</m:t>
+        </m:r>
+      </m:oMath>
+      <w:r>
+        <w:t xml:space="preserve"> </w:t>
+      </w:r>
+      <w:r>
+        <w:t xml:space="preserve">with</w:t>
+      </w:r>
+      <w:r>
+        <w:t xml:space="preserve"> </w:t>
+      </w:r>
+      <m:oMath>
+        <m:r>
+          <m:t>A</m:t>
+        </m:r>
+        <m:r>
+          <m:rPr>
+            <m:sty m:val="p"/>
+          </m:rPr>
+          <m:t>=</m:t>
+        </m:r>
+        <m:r>
+          <m:t>I</m:t>
+        </m:r>
+      </m:oMath>
+      <w:r>
+        <w:t xml:space="preserve"> </w:t>
+      </w:r>
+      <w:r>
+        <w:t xml:space="preserve">for transparent plotting; the benchmark figure explores</w:t>
+      </w:r>
+      <w:r>
+        <w:t xml:space="preserve"> </w:t>
+      </w:r>
+      <m:oMath>
+        <m:r>
+          <m:t>d</m:t>
+        </m:r>
+        <m:r>
+          <m:rPr>
+            <m:sty m:val="p"/>
+          </m:rPr>
+          <m:t>&gt;</m:t>
+        </m:r>
+        <m:r>
+          <m:t>1</m:t>
+        </m:r>
+      </m:oMath>
+      <w:r>
+        <w:t xml:space="preserve"> </w:t>
+      </w:r>
+      <w:r>
+        <w:t xml:space="preserve">only with identity Hessians, so no ill-conditioning effects appear.</w:t>
+      </w:r>
+    </w:p>
+    <w:p>
+      <w:pPr>
+        <w:pStyle w:val="Compact"/>
+        <w:numPr>
+          <w:ilvl w:val="0"/>
+          <w:numId w:val="1032"/>
+        </w:numPr>
+      </w:pPr>
+      <w:r>
+        <w:rPr>
+          <w:b/>
+          <w:bCs/>
+        </w:rPr>
+        <w:t xml:space="preserve">Step-size policy</w:t>
+      </w:r>
+      <w:r>
+        <w:t xml:space="preserve">: Only constant</w:t>
+      </w:r>
+      <w:r>
+        <w:t xml:space="preserve"> </w:t>
+      </w:r>
+      <m:oMath>
+        <m:r>
+          <m:t>α</m:t>
+        </m:r>
+      </m:oMath>
+      <w:r>
+        <w:t xml:space="preserve"> </w:t>
+      </w:r>
+      <w:r>
+        <w:t xml:space="preserve">is implemented in</w:t>
+      </w:r>
+      <w:r>
+        <w:t xml:space="preserve"> </w:t>
+      </w:r>
+      <w:r>
+        <w:rPr>
+          <w:rStyle w:val="VerbatimChar"/>
+        </w:rPr>
+        <w:t xml:space="preserve">src/template_code_project/core/optimizer.py</w:t>
+      </w:r>
+      <w:r>
+        <w:t xml:space="preserve">; there is no Wolfe or Armijo backtracking.</w:t>
+      </w:r>
+    </w:p>
+    <w:p>
+      <w:pPr>
+        <w:pStyle w:val="Compact"/>
+        <w:numPr>
+          <w:ilvl w:val="0"/>
+          <w:numId w:val="1032"/>
+        </w:numPr>
+      </w:pPr>
+      <w:r>
+        <w:rPr>
+          <w:b/>
+          <w:bCs/>
+        </w:rPr>
+        <w:t xml:space="preserve">Global optimization</w:t>
+      </w:r>
+      <w:r>
+        <w:t xml:space="preserve">: Convexity is assumed; no basin-hopping or restarts are studied.</w:t>
+      </w:r>
+    </w:p>
+    <w:p>
+      <w:pPr>
+        <w:pStyle w:val="Compact"/>
+        <w:numPr>
+          <w:ilvl w:val="0"/>
+          <w:numId w:val="1032"/>
         </w:numPr>
       </w:pPr>
       <w:r>
@@ -17311,6 +17355,9 @@
     <w:abstractNumId w:val="991"/>
   </w:num>
   <w:num w:numId="1020">
+    <w:abstractNumId w:val="991"/>
+  </w:num>
+  <w:num w:numId="1021">
     <w:abstractNumId w:val="99411"/>
     <w:lvlOverride w:ilvl="0">
       <w:startOverride w:val="1"/>
@@ -17340,9 +17387,6 @@
       <w:startOverride w:val="1"/>
     </w:lvlOverride>
   </w:num>
-  <w:num w:numId="1021">
-    <w:abstractNumId w:val="991"/>
-  </w:num>
   <w:num w:numId="1022">
     <w:abstractNumId w:val="991"/>
   </w:num>
@@ -17350,6 +17394,9 @@
     <w:abstractNumId w:val="991"/>
   </w:num>
   <w:num w:numId="1024">
+    <w:abstractNumId w:val="991"/>
+  </w:num>
+  <w:num w:numId="1025">
     <w:abstractNumId w:val="99411"/>
     <w:lvlOverride w:ilvl="0">
       <w:startOverride w:val="1"/>
@@ -17379,9 +17426,6 @@
       <w:startOverride w:val="1"/>
     </w:lvlOverride>
   </w:num>
-  <w:num w:numId="1025">
-    <w:abstractNumId w:val="991"/>
-  </w:num>
   <w:num w:numId="1026">
     <w:abstractNumId w:val="991"/>
   </w:num>
@@ -17389,6 +17433,9 @@
     <w:abstractNumId w:val="991"/>
   </w:num>
   <w:num w:numId="1028">
+    <w:abstractNumId w:val="991"/>
+  </w:num>
+  <w:num w:numId="1029">
     <w:abstractNumId w:val="99411"/>
     <w:lvlOverride w:ilvl="0">
       <w:startOverride w:val="1"/>
@@ -17418,13 +17465,13 @@
       <w:startOverride w:val="1"/>
     </w:lvlOverride>
   </w:num>
-  <w:num w:numId="1029">
-    <w:abstractNumId w:val="991"/>
-  </w:num>
   <w:num w:numId="1030">
     <w:abstractNumId w:val="991"/>
   </w:num>
   <w:num w:numId="1031">
+    <w:abstractNumId w:val="991"/>
+  </w:num>
+  <w:num w:numId="1032">
     <w:abstractNumId w:val="99411"/>
     <w:lvlOverride w:ilvl="0">
       <w:startOverride w:val="1"/>

</xml_diff>

<commit_message>
Bind every exemplar's manuscript publication metadata to 4.4.0
The readiness profile requires each exemplar's `manuscript/config.yaml`
`publication.platform_version` to match the root version, so the version bump
left all 25 declaration gates invalid even though the pyproject contracts already
declared 4.4.0. The manuscript pins move to 4.4.0 and every exemplar's producers
re-ran, which regenerates the injected publication copy and rebinds the
rendered-provenance receipts.
</commit_message>
<xml_diff>
--- a/projects/templates/template_code_project/output/docx/template_code_project_combined.docx
+++ b/projects/templates/template_code_project/output/docx/template_code_project_combined.docx
@@ -14235,7 +14235,7 @@
         <w:t xml:space="preserve">Generated</w:t>
       </w:r>
       <w:r>
-        <w:t xml:space="preserve">: 2026-10-29T18:15:46Z</w:t>
+        <w:t xml:space="preserve">: 2026-10-29T19:19:20Z</w:t>
       </w:r>
     </w:p>
     <w:p>
@@ -14881,7 +14881,7 @@
               <w:rPr>
                 <w:rStyle w:val="VerbatimChar"/>
               </w:rPr>
-              <w:t xml:space="preserve">4bab2327e6fbe051</w:t>
+              <w:t xml:space="preserve">90af55804b33d331</w:t>
             </w:r>
           </w:p>
         </w:tc>

</xml_diff>

<commit_message>
Declare the 4.4.0 platform in every exemplar guard and renew coverage provenance
The exemplars' bootstrap and conftest guards compare the installed SDK to a
literal declared platform version, so the coordinated bump had to move those
literals as well: `"4.3.0"` becomes `"4.4.0"` across exemplar `scripts/`, `src/`
and `tests/`, including the messages that the mismatch tests match on. The
coverage provenance snapshot is regenerated for the changed inputs.
</commit_message>
<xml_diff>
--- a/projects/templates/template_code_project/output/docx/template_code_project_combined.docx
+++ b/projects/templates/template_code_project/output/docx/template_code_project_combined.docx
@@ -14178,7 +14178,7 @@
         <w:t xml:space="preserve">Python</w:t>
       </w:r>
       <w:r>
-        <w:t xml:space="preserve">: 3.14.9</w:t>
+        <w:t xml:space="preserve">: 3.15.1</w:t>
       </w:r>
     </w:p>
     <w:p>
@@ -14235,7 +14235,7 @@
         <w:t xml:space="preserve">Generated</w:t>
       </w:r>
       <w:r>
-        <w:t xml:space="preserve">: 2026-10-29T19:19:20Z</w:t>
+        <w:t xml:space="preserve">: 2026-10-29T20:01:36Z</w:t>
       </w:r>
     </w:p>
     <w:p>

</xml_diff>

<commit_message>
Refresh validated 4.4.1 public exemplar outputs
</commit_message>
<xml_diff>
--- a/projects/templates/template_code_project/output/docx/template_code_project_combined.docx
+++ b/projects/templates/template_code_project/output/docx/template_code_project_combined.docx
@@ -9981,7 +9981,7 @@
       <w:r>
         <w:drawing>
           <wp:inline>
-            <wp:extent cx="5334000" cy="6237349"/>
+            <wp:extent cx="5334000" cy="6235846"/>
             <wp:effectExtent b="0" l="0" r="0" t="0"/>
             <wp:docPr descr="Figure 4: Six-panel diagnostic from generate_complexity_visualization() (3×2 grid)." title="" id="88" name="Picture"/>
             <a:graphic>
@@ -10002,7 +10002,7 @@
                   <pic:spPr bwMode="auto">
                     <a:xfrm>
                       <a:off x="0" y="0"/>
-                      <a:ext cx="5334000" cy="6237349"/>
+                      <a:ext cx="5334000" cy="6235846"/>
                     </a:xfrm>
                     <a:prstGeom prst="rect">
                       <a:avLst/>
@@ -11159,7 +11159,7 @@
       <w:r>
         <w:drawing>
           <wp:inline>
-            <wp:extent cx="5334000" cy="2251305"/>
+            <wp:extent cx="5334000" cy="2250763"/>
             <wp:effectExtent b="0" l="0" r="0" t="0"/>
             <wp:docPr descr="Figure 5: Deterministic dimensional benchmark from generate_benchmark_visualization(). Dimensions d \in \{1, 2, 5, 10, 20, 50\} run on identity-Hessian quadratics with \alpha=0.1 and gradient tolerance 10^{-10}. Left: the implementation-independent work proxy d \times \text{iterations}, proportional to scalar elements processed by the dense matrix-vector update. Right: exact iterations to convergence. Wall-clock microseconds are intentionally excluded because they vary with hardware and host load. The similar iteration counts are expected because \kappa(I_d)=1 and the contraction factor \rho=|1-\alpha|=0.9 is dimension-independent." title="" id="93" name="Picture"/>
             <a:graphic>
@@ -11180,7 +11180,7 @@
                   <pic:spPr bwMode="auto">
                     <a:xfrm>
                       <a:off x="0" y="0"/>
-                      <a:ext cx="5334000" cy="2251305"/>
+                      <a:ext cx="5334000" cy="2250763"/>
                     </a:xfrm>
                     <a:prstGeom prst="rect">
                       <a:avLst/>
@@ -14178,7 +14178,7 @@
         <w:t xml:space="preserve">Python</w:t>
       </w:r>
       <w:r>
-        <w:t xml:space="preserve">: 3.15.1</w:t>
+        <w:t xml:space="preserve">: 3.14.9</w:t>
       </w:r>
     </w:p>
     <w:p>
@@ -14235,7 +14235,7 @@
         <w:t xml:space="preserve">Generated</w:t>
       </w:r>
       <w:r>
-        <w:t xml:space="preserve">: 2026-10-29T21:56:17Z</w:t>
+        <w:t xml:space="preserve">: 2026-10-30T20:28:00Z</w:t>
       </w:r>
     </w:p>
     <w:p>
@@ -14881,7 +14881,7 @@
               <w:rPr>
                 <w:rStyle w:val="VerbatimChar"/>
               </w:rPr>
-              <w:t xml:space="preserve">90af55804b33d331</w:t>
+              <w:t xml:space="preserve">4022289be2025fec</w:t>
             </w:r>
           </w:p>
         </w:tc>

</xml_diff>

<commit_message>
Regenerate all public 4.5.0 publication outputs and provenance
</commit_message>
<xml_diff>
--- a/projects/templates/template_code_project/output/docx/template_code_project_combined.docx
+++ b/projects/templates/template_code_project/output/docx/template_code_project_combined.docx
@@ -14235,7 +14235,7 @@
         <w:t xml:space="preserve">Generated</w:t>
       </w:r>
       <w:r>
-        <w:t xml:space="preserve">: 2026-10-30T21:53:23Z</w:t>
+        <w:t xml:space="preserve">: 2026-10-31T02:22:03Z</w:t>
       </w:r>
     </w:p>
     <w:p>
@@ -14881,7 +14881,7 @@
               <w:rPr>
                 <w:rStyle w:val="VerbatimChar"/>
               </w:rPr>
-              <w:t xml:space="preserve">4022289be2025fec</w:t>
+              <w:t xml:space="preserve">768fd92fa8cb45a7</w:t>
             </w:r>
           </w:p>
         </w:tc>

</xml_diff>